<commit_message>
Restored vev_tmpl.docx and correctly injected placeholders using ZipArchive
</commit_message>
<xml_diff>
--- a/files/vev_tmpl.docx
+++ b/files/vev_tmpl.docx
@@ -1,1281 +1,6 @@
 
-<file path=word/document.xml><?xml version="1.0" encoding="utf-8"?>
-<w:document xmlns:wpc="http://schemas.microsoft.com/office/word/2010/wordprocessingCanvas" xmlns:cx="http://schemas.microsoft.com/office/drawing/2014/chartex" xmlns:cx1="http://schemas.microsoft.com/office/drawing/2015/9/8/chartex" xmlns:cx2="http://schemas.microsoft.com/office/drawing/2015/10/21/chartex" xmlns:cx3="http://schemas.microsoft.com/office/drawing/2016/5/9/chartex" xmlns:cx4="http://schemas.microsoft.com/office/drawing/2016/5/10/chartex" xmlns:cx5="http://schemas.microsoft.com/office/drawing/2016/5/11/chartex" xmlns:cx6="http://schemas.microsoft.com/office/drawing/2016/5/12/chartex" xmlns:cx7="http://schemas.microsoft.com/office/drawing/2016/5/13/chartex" xmlns:cx8="http://schemas.microsoft.com/office/drawing/2016/5/14/chartex" xmlns:mc="http://schemas.openxmlformats.org/markup-compatibility/2006" xmlns:aink="http://schemas.microsoft.com/office/drawing/2016/ink" xmlns:am3d="http://schemas.microsoft.com/office/drawing/2017/model3d" xmlns:o="urn:schemas-microsoft-com:office:office" xmlns:oel="http://schemas.microsoft.com/office/2019/extlst" xmlns:r="http://schemas.openxmlformats.org/officeDocument/2006/relationships" xmlns:m="http://schemas.openxmlformats.org/officeDocument/2006/math" xmlns:v="urn:schemas-microsoft-com:vml" xmlns:wp14="http://schemas.microsoft.com/office/word/2010/wordprocessingDrawing" xmlns:wp="http://schemas.openxmlformats.org/drawingml/2006/wordprocessingDrawing" xmlns:w10="urn:schemas-microsoft-com:office:word" xmlns:w="http://schemas.openxmlformats.org/wordprocessingml/2006/main" xmlns:w14="http://schemas.microsoft.com/office/word/2010/wordml" xmlns:w15="http://schemas.microsoft.com/office/word/2012/wordml" xmlns:w16cex="http://schemas.microsoft.com/office/word/2018/wordml/cex" xmlns:w16cid="http://schemas.microsoft.com/office/word/2016/wordml/cid" xmlns:w16="http://schemas.microsoft.com/office/word/2018/wordml" xmlns:w16du="http://schemas.microsoft.com/office/word/2023/wordml/word16du" xmlns:w16sdtdh="http://schemas.microsoft.com/office/word/2020/wordml/sdtdatahash" xmlns:w16se="http://schemas.microsoft.com/office/word/2015/wordml/symex" xmlns:wpg="http://schemas.microsoft.com/office/word/2010/wordprocessingGroup" xmlns:wpi="http://schemas.microsoft.com/office/word/2010/wordprocessingInk" xmlns:wne="http://schemas.microsoft.com/office/word/2006/wordml" xmlns:wps="http://schemas.microsoft.com/office/word/2010/wordprocessingShape" mc:Ignorable="w14 w15 w16se w16cid w16 w16cex w16sdtdh w16du wp14">
-  <w:body>
-    <w:p/>
-    <w:tbl>
-      <w:tblPr>
-        <w:tblpPr w:leftFromText="180" w:rightFromText="180" w:vertAnchor="page" w:horzAnchor="margin" w:tblpY="1135"/>
-        <w:tblW w:w="10468" w:type="dxa"/>
-        <w:tblLook w:val="01E0" w:firstRow="1" w:lastRow="1" w:firstColumn="1" w:lastColumn="1" w:noHBand="0" w:noVBand="0"/>
-      </w:tblPr>
-      <w:tblGrid>
-        <w:gridCol w:w="5812"/>
-        <w:gridCol w:w="4656"/>
-      </w:tblGrid>
-      <w:tr>
-        <w:tc>
-          <w:tcPr>
-            <w:tcW w:w="5812" w:type="dxa"/>
-            <w:shd w:val="clear" w:color="auto" w:fill="auto"/>
-          </w:tcPr>
-          <w:p>
-            <w:pPr>
-              <w:ind w:right="-514"/>
-              <w:jc w:val="center"/>
-              <w:rPr>
-                <w:rFonts w:ascii="Calibri" w:hAnsi="Calibri"/>
-                <w:b/>
-                <w:sz w:val="22"/>
-                <w:szCs w:val="22"/>
-              </w:rPr>
-            </w:pPr>
-            <w:r>
-              <w:rPr>
-                <w:rFonts w:ascii="Calibri" w:hAnsi="Calibri"/>
-                <w:b/>
-              </w:rPr>
-              <w:object w:dxaOrig="701" w:dyaOrig="686" w14:anchorId="70D8E824">
-                <v:shapetype id="_x0000_t75" coordsize="21600,21600" o:spt="75" o:preferrelative="t" path="m@4@5l@4@11@9@11@9@5xe" filled="f" stroked="f">
-                  <v:stroke joinstyle="miter"/>
-                  <v:formulas>
-                    <v:f eqn="if lineDrawn pixelLineWidth 0"/>
-                    <v:f eqn="sum @0 1 0"/>
-                    <v:f eqn="sum 0 0 @1"/>
-                    <v:f eqn="prod @2 1 2"/>
-                    <v:f eqn="prod @3 21600 pixelWidth"/>
-                    <v:f eqn="prod @3 21600 pixelHeight"/>
-                    <v:f eqn="sum @0 0 1"/>
-                    <v:f eqn="prod @6 1 2"/>
-                    <v:f eqn="prod @7 21600 pixelWidth"/>
-                    <v:f eqn="sum @8 21600 0"/>
-                    <v:f eqn="prod @7 21600 pixelHeight"/>
-                    <v:f eqn="sum @10 21600 0"/>
-                  </v:formulas>
-                  <v:path o:extrusionok="f" gradientshapeok="t" o:connecttype="rect"/>
-                  <o:lock v:ext="edit" aspectratio="t"/>
-                </v:shapetype>
-                <v:shape id="_x0000_i1025" type="#_x0000_t75" style="width:26.25pt;height:25.5pt" o:ole="" fillcolor="window">
-                  <v:imagedata r:id="rId6" o:title=""/>
-                </v:shape>
-                <o:OLEObject Type="Embed" ProgID="Word.Picture.8" ShapeID="_x0000_i1025" DrawAspect="Content" ObjectID="_1788598467" r:id="rId7"/>
-              </w:object>
-            </w:r>
-          </w:p>
-          <w:p>
-            <w:pPr>
-              <w:ind w:right="-514"/>
-              <w:jc w:val="center"/>
-              <w:rPr>
-                <w:rFonts w:ascii="Calibri" w:hAnsi="Calibri"/>
-                <w:b/>
-              </w:rPr>
-            </w:pPr>
-            <w:r>
-              <w:rPr>
-                <w:rFonts w:ascii="Calibri" w:hAnsi="Calibri"/>
-                <w:b/>
-              </w:rPr>
-              <w:t>ΕΛΛΗΝΙΚΗ ΔΗΜΟΚΡΑΤΙΑ</w:t>
-            </w:r>
-          </w:p>
-          <w:p>
-            <w:pPr>
-              <w:ind w:right="-514"/>
-              <w:jc w:val="center"/>
-              <w:rPr>
-                <w:rFonts w:ascii="Calibri" w:hAnsi="Calibri"/>
-                <w:b/>
-              </w:rPr>
-            </w:pPr>
-            <w:r>
-              <w:rPr>
-                <w:rFonts w:ascii="Calibri" w:hAnsi="Calibri"/>
-                <w:b/>
-              </w:rPr>
-              <w:t>ΥΠΟΥΡΓΕΙΟ ΠΑΙΔΕΙΑΣ</w:t>
-            </w:r>
-            <w:r>
-              <w:rPr>
-                <w:rFonts w:ascii="Calibri" w:hAnsi="Calibri"/>
-                <w:b/>
-              </w:rPr>
-              <w:t xml:space="preserve">, </w:t>
-            </w:r>
-            <w:r>
-              <w:rPr>
-                <w:rFonts w:ascii="Calibri" w:hAnsi="Calibri"/>
-                <w:b/>
-              </w:rPr>
-              <w:t>ΘΡΗΣΚΕΥΜΑΤΩΝ</w:t>
-            </w:r>
-            <w:r>
-              <w:rPr>
-                <w:rFonts w:ascii="Calibri" w:hAnsi="Calibri"/>
-                <w:b/>
-              </w:rPr>
-              <w:t xml:space="preserve"> </w:t>
-            </w:r>
-          </w:p>
-          <w:p>
-            <w:pPr>
-              <w:ind w:right="-514"/>
-              <w:jc w:val="center"/>
-              <w:rPr>
-                <w:rFonts w:ascii="Calibri" w:hAnsi="Calibri"/>
-                <w:b/>
-              </w:rPr>
-            </w:pPr>
-            <w:r>
-              <w:rPr>
-                <w:rFonts w:ascii="Calibri" w:hAnsi="Calibri"/>
-                <w:b/>
-              </w:rPr>
-              <w:t>&amp; ΑΘΛΗΤΙΣΜΟΥ</w:t>
-            </w:r>
-          </w:p>
-          <w:p>
-            <w:pPr>
-              <w:ind w:right="-514"/>
-              <w:rPr>
-                <w:rFonts w:ascii="Calibri" w:hAnsi="Calibri"/>
-                <w:b/>
-              </w:rPr>
-            </w:pPr>
-            <w:r>
-              <w:rPr>
-                <w:rFonts w:ascii="Calibri" w:hAnsi="Calibri"/>
-                <w:b/>
-              </w:rPr>
-              <w:t xml:space="preserve">                       ………………………………………………………..</w:t>
-            </w:r>
-          </w:p>
-          <w:p>
-            <w:pPr>
-              <w:ind w:right="-514"/>
-              <w:jc w:val="center"/>
-              <w:rPr>
-                <w:rFonts w:ascii="Calibri" w:hAnsi="Calibri"/>
-                <w:b/>
-              </w:rPr>
-            </w:pPr>
-            <w:r>
-              <w:rPr>
-                <w:rFonts w:ascii="Calibri" w:hAnsi="Calibri"/>
-                <w:b/>
-              </w:rPr>
-              <w:t>ΠΕΡΙΦΕΡΕΙΑΚΗ Δ/ΝΣΗ Π/ΘΜΙΑΣ</w:t>
-            </w:r>
-          </w:p>
-          <w:p>
-            <w:pPr>
-              <w:ind w:right="-514"/>
-              <w:jc w:val="center"/>
-              <w:rPr>
-                <w:rFonts w:ascii="Calibri" w:hAnsi="Calibri"/>
-                <w:b/>
-              </w:rPr>
-            </w:pPr>
-            <w:r>
-              <w:rPr>
-                <w:rFonts w:ascii="Calibri" w:hAnsi="Calibri"/>
-                <w:b/>
-              </w:rPr>
-              <w:t>&amp;  Β/ΘΜΙΑΣ ΕΚΠ/ΣΗΣ  ΚΡΗΤΗΣ</w:t>
-            </w:r>
-          </w:p>
-          <w:p>
-            <w:pPr>
-              <w:ind w:right="-514"/>
-              <w:jc w:val="center"/>
-              <w:rPr>
-                <w:rFonts w:ascii="Calibri" w:hAnsi="Calibri"/>
-                <w:b/>
-              </w:rPr>
-            </w:pPr>
-            <w:r>
-              <w:rPr>
-                <w:rFonts w:ascii="Calibri" w:hAnsi="Calibri"/>
-                <w:b/>
-              </w:rPr>
-              <w:t>Δ/ΝΣΗ Π/ΘΜΙΑΣ ΕΚΠ/ΣΗΣ ΗΡΑΚΛΕΙΟΥ</w:t>
-            </w:r>
-          </w:p>
-          <w:p>
-            <w:pPr>
-              <w:jc w:val="center"/>
-              <w:rPr>
-                <w:rFonts w:ascii="Calibri" w:hAnsi="Calibri"/>
-                <w:b/>
-                <w:sz w:val="28"/>
-                <w:szCs w:val="28"/>
-              </w:rPr>
-            </w:pPr>
-            <w:r>
-              <w:rPr>
-                <w:rFonts w:ascii="Calibri" w:hAnsi="Calibri"/>
-                <w:b/>
-                <w:sz w:val="28"/>
-                <w:szCs w:val="28"/>
-              </w:rPr>
-              <w:t xml:space="preserve">      </w:t>
-            </w:r>
-            <w:r>
-              <w:rPr>
-                <w:rFonts w:ascii="Calibri" w:hAnsi="Calibri"/>
-                <w:b/>
-                <w:sz w:val="28"/>
-                <w:szCs w:val="28"/>
-              </w:rPr>
-              <w:t>ΤΜΗΜΑ</w:t>
-            </w:r>
-            <w:r>
-              <w:rPr>
-                <w:rFonts w:ascii="Calibri" w:hAnsi="Calibri"/>
-                <w:b/>
-                <w:sz w:val="28"/>
-                <w:szCs w:val="28"/>
-              </w:rPr>
-              <w:t xml:space="preserve"> ΣΧΟΛΙΚΩΝ ΔΡΑΣΤΗΡΙΟΤΗΤΩΝ</w:t>
-            </w:r>
-          </w:p>
-          <w:p>
-            <w:pPr>
-              <w:jc w:val="center"/>
-              <w:rPr>
-                <w:rFonts w:ascii="Calibri" w:hAnsi="Calibri"/>
-                <w:b/>
-                <w:sz w:val="18"/>
-                <w:szCs w:val="18"/>
-              </w:rPr>
-            </w:pPr>
-          </w:p>
-        </w:tc>
-        <w:tc>
-          <w:tcPr>
-            <w:tcW w:w="4656" w:type="dxa"/>
-            <w:shd w:val="clear" w:color="auto" w:fill="auto"/>
-          </w:tcPr>
-          <w:p>
-            <w:pPr>
-              <w:jc w:val="right"/>
-              <w:rPr>
-                <w:rFonts w:ascii="Calibri" w:hAnsi="Calibri"/>
-                <w:b/>
-              </w:rPr>
-            </w:pPr>
-          </w:p>
-          <w:p>
-            <w:pPr>
-              <w:jc w:val="right"/>
-              <w:rPr>
-                <w:rFonts w:ascii="Calibri" w:hAnsi="Calibri"/>
-                <w:b/>
-              </w:rPr>
-            </w:pPr>
-          </w:p>
-          <w:p>
-            <w:pPr>
-              <w:ind w:left="626" w:right="613"/>
-              <w:rPr>
-                <w:rFonts w:ascii="Calibri" w:hAnsi="Calibri"/>
-                <w:b/>
-              </w:rPr>
-            </w:pPr>
-            <w:r>
-              <w:rPr>
-                <w:rFonts w:ascii="Calibri" w:hAnsi="Calibri"/>
-                <w:b/>
-              </w:rPr>
-              <w:t>Ηράκλειο,</w:t>
-            </w:r>
-            <w:r>
-              <w:rPr>
-                <w:rFonts w:ascii="Calibri" w:hAnsi="Calibri"/>
-                <w:b/>
-                <w:lang w:val="en-US"/>
-              </w:rPr>
-              <w:t xml:space="preserve"> </w:t>
-            </w:r>
-            <w:r>
-              <w:rPr>
-                <w:rFonts w:ascii="Calibri" w:hAnsi="Calibri"/>
-                <w:b/>
-              </w:rPr>
-              <w:t>25/</w:t>
-            </w:r>
-            <w:r>
-              <w:rPr>
-                <w:rFonts w:ascii="Calibri" w:hAnsi="Calibri"/>
-                <w:b/>
-              </w:rPr>
-              <w:t>0</w:t>
-            </w:r>
-            <w:r>
-              <w:rPr>
-                <w:rFonts w:ascii="Calibri" w:hAnsi="Calibri"/>
-                <w:b/>
-              </w:rPr>
-              <w:t>6/2024</w:t>
-            </w:r>
-          </w:p>
-          <w:p>
-            <w:pPr>
-              <w:ind w:left="626" w:right="613"/>
-              <w:rPr>
-                <w:rFonts w:ascii="Calibri" w:hAnsi="Calibri"/>
-                <w:b/>
-              </w:rPr>
-            </w:pPr>
-            <w:r>
-              <w:rPr>
-                <w:rFonts w:ascii="Calibri" w:hAnsi="Calibri"/>
-                <w:b/>
-              </w:rPr>
-              <w:t xml:space="preserve">Αρ. Πρωτ.: </w:t>
-            </w:r>
-            <w:r>
-              <w:rPr>
-                <w:rFonts w:ascii="Calibri" w:hAnsi="Calibri"/>
-                <w:b/>
-              </w:rPr>
-              <w:t>10268</w:t>
-            </w:r>
-          </w:p>
-          <w:p>
-            <w:pPr>
-              <w:ind w:left="1832"/>
-              <w:rPr>
-                <w:rFonts w:ascii="Calibri" w:hAnsi="Calibri"/>
-                <w:b/>
-              </w:rPr>
-            </w:pPr>
-          </w:p>
-          <w:p>
-            <w:pPr>
-              <w:ind w:left="660"/>
-              <w:rPr>
-                <w:rFonts w:ascii="Calibri" w:hAnsi="Calibri"/>
-                <w:b/>
-              </w:rPr>
-            </w:pPr>
-          </w:p>
-        </w:tc>
-      </w:tr>
-      <w:tr>
-        <w:trPr>
-          <w:trHeight w:val="1985"/>
-        </w:trPr>
-        <w:tc>
-          <w:tcPr>
-            <w:tcW w:w="5812" w:type="dxa"/>
-            <w:shd w:val="clear" w:color="auto" w:fill="auto"/>
-          </w:tcPr>
-          <w:p>
-            <w:pPr>
-              <w:rPr>
-                <w:rFonts w:ascii="Calibri" w:hAnsi="Calibri"/>
-              </w:rPr>
-            </w:pPr>
-            <w:r>
-              <w:rPr>
-                <w:rFonts w:ascii="Calibri" w:hAnsi="Calibri"/>
-              </w:rPr>
-              <w:t>Ταχ. Δ/νση     :</w:t>
-            </w:r>
-            <w:r>
-              <w:rPr>
-                <w:rFonts w:ascii="Calibri" w:hAnsi="Calibri"/>
-                <w:b/>
-              </w:rPr>
-              <w:t xml:space="preserve">  </w:t>
-            </w:r>
-            <w:r>
-              <w:rPr>
-                <w:rFonts w:ascii="Calibri" w:hAnsi="Calibri"/>
-              </w:rPr>
-              <w:t>Πιτσουλάκη 73</w:t>
-            </w:r>
-          </w:p>
-          <w:p>
-            <w:pPr>
-              <w:rPr>
-                <w:rFonts w:ascii="Calibri" w:hAnsi="Calibri"/>
-              </w:rPr>
-            </w:pPr>
-            <w:r>
-              <w:rPr>
-                <w:rFonts w:ascii="Calibri" w:hAnsi="Calibri"/>
-              </w:rPr>
-              <w:t>Ταχ. Κώδικας</w:t>
-            </w:r>
-            <w:r>
-              <w:rPr>
-                <w:rFonts w:ascii="Calibri" w:hAnsi="Calibri"/>
-              </w:rPr>
-              <w:t xml:space="preserve"> </w:t>
-            </w:r>
-            <w:r>
-              <w:rPr>
-                <w:rFonts w:ascii="Calibri" w:hAnsi="Calibri"/>
-              </w:rPr>
-              <w:t>:  713 07</w:t>
-            </w:r>
-            <w:r>
-              <w:rPr>
-                <w:rFonts w:ascii="Calibri" w:hAnsi="Calibri"/>
-              </w:rPr>
-              <w:t xml:space="preserve"> Ηράκλειο</w:t>
-            </w:r>
-          </w:p>
-          <w:p>
-            <w:pPr>
-              <w:rPr>
-                <w:rFonts w:ascii="Calibri" w:hAnsi="Calibri"/>
-                <w:lang w:val="en-US"/>
-              </w:rPr>
-            </w:pPr>
-            <w:r>
-              <w:rPr>
-                <w:rFonts w:ascii="Calibri" w:hAnsi="Calibri"/>
-              </w:rPr>
-              <w:t>Τηλέφωνο</w:t>
-            </w:r>
-            <w:r>
-              <w:rPr>
-                <w:rFonts w:ascii="Calibri" w:hAnsi="Calibri"/>
-                <w:lang w:val="en-US"/>
-              </w:rPr>
-              <w:t xml:space="preserve">      :  2810 529313</w:t>
-            </w:r>
-          </w:p>
-          <w:p>
-            <w:pPr>
-              <w:rPr>
-                <w:rFonts w:ascii="Calibri" w:hAnsi="Calibri"/>
-                <w:lang w:val="fr-FR"/>
-              </w:rPr>
-            </w:pPr>
-            <w:r>
-              <w:rPr>
-                <w:rFonts w:ascii="Calibri" w:hAnsi="Calibri"/>
-                <w:lang w:val="de-DE"/>
-              </w:rPr>
-              <w:t>E</w:t>
-            </w:r>
-            <w:r>
-              <w:rPr>
-                <w:rFonts w:ascii="Calibri" w:hAnsi="Calibri"/>
-                <w:lang w:val="fr-FR"/>
-              </w:rPr>
-              <w:t>-</w:t>
-            </w:r>
-            <w:r>
-              <w:rPr>
-                <w:rFonts w:ascii="Calibri" w:hAnsi="Calibri"/>
-                <w:lang w:val="de-DE"/>
-              </w:rPr>
-              <w:t>mail</w:t>
-            </w:r>
-            <w:r>
-              <w:rPr>
-                <w:rFonts w:ascii="Calibri" w:hAnsi="Calibri"/>
-                <w:lang w:val="fr-FR"/>
-              </w:rPr>
-              <w:t xml:space="preserve">             :  </w:t>
-            </w:r>
-            <w:hyperlink r:id="rId8" w:history="1">
-              <w:r>
-                <w:rPr>
-                  <w:rStyle w:val="-"/>
-                  <w:rFonts w:ascii="Calibri" w:hAnsi="Calibri"/>
-                  <w:lang w:val="de-DE"/>
-                </w:rPr>
-                <w:t>tay</w:t>
-              </w:r>
-              <w:r>
-                <w:rPr>
-                  <w:rStyle w:val="-"/>
-                  <w:rFonts w:ascii="Calibri" w:hAnsi="Calibri"/>
-                  <w:lang w:val="fr-FR"/>
-                </w:rPr>
-                <w:t>@</w:t>
-              </w:r>
-              <w:r>
-                <w:rPr>
-                  <w:rStyle w:val="-"/>
-                  <w:rFonts w:ascii="Calibri" w:hAnsi="Calibri"/>
-                  <w:lang w:val="de-DE"/>
-                </w:rPr>
-                <w:t>dipe</w:t>
-              </w:r>
-              <w:r>
-                <w:rPr>
-                  <w:rStyle w:val="-"/>
-                  <w:rFonts w:ascii="Calibri" w:hAnsi="Calibri"/>
-                  <w:lang w:val="fr-FR"/>
-                </w:rPr>
-                <w:t>.</w:t>
-              </w:r>
-              <w:r>
-                <w:rPr>
-                  <w:rStyle w:val="-"/>
-                  <w:rFonts w:ascii="Calibri" w:hAnsi="Calibri"/>
-                  <w:lang w:val="de-DE"/>
-                </w:rPr>
-                <w:t>ira</w:t>
-              </w:r>
-              <w:r>
-                <w:rPr>
-                  <w:rStyle w:val="-"/>
-                  <w:rFonts w:ascii="Calibri" w:hAnsi="Calibri"/>
-                  <w:lang w:val="fr-FR"/>
-                </w:rPr>
-                <w:t>.</w:t>
-              </w:r>
-              <w:r>
-                <w:rPr>
-                  <w:rStyle w:val="-"/>
-                  <w:rFonts w:ascii="Calibri" w:hAnsi="Calibri"/>
-                  <w:lang w:val="de-DE"/>
-                </w:rPr>
-                <w:t>sch</w:t>
-              </w:r>
-              <w:r>
-                <w:rPr>
-                  <w:rStyle w:val="-"/>
-                  <w:rFonts w:ascii="Calibri" w:hAnsi="Calibri"/>
-                  <w:lang w:val="fr-FR"/>
-                </w:rPr>
-                <w:t>.</w:t>
-              </w:r>
-              <w:r>
-                <w:rPr>
-                  <w:rStyle w:val="-"/>
-                  <w:rFonts w:ascii="Calibri" w:hAnsi="Calibri"/>
-                  <w:lang w:val="de-DE"/>
-                </w:rPr>
-                <w:t>gr</w:t>
-              </w:r>
-            </w:hyperlink>
-            <w:r>
-              <w:rPr>
-                <w:rFonts w:ascii="Calibri" w:hAnsi="Calibri"/>
-                <w:lang w:val="fr-FR"/>
-              </w:rPr>
-              <w:t xml:space="preserve"> </w:t>
-            </w:r>
-          </w:p>
-        </w:tc>
-        <w:tc>
-          <w:tcPr>
-            <w:tcW w:w="4656" w:type="dxa"/>
-            <w:shd w:val="clear" w:color="auto" w:fill="auto"/>
-          </w:tcPr>
-          <w:p>
-            <w:pPr>
-              <w:ind w:left="360"/>
-              <w:rPr>
-                <w:rFonts w:ascii="Calibri" w:hAnsi="Calibri"/>
-                <w:b/>
-                <w:color w:val="999999"/>
-                <w:sz w:val="22"/>
-                <w:szCs w:val="22"/>
-                <w:lang w:val="fr-FR"/>
-              </w:rPr>
-            </w:pPr>
-          </w:p>
-          <w:p>
-            <w:pPr>
-              <w:ind w:left="360"/>
-              <w:rPr>
-                <w:rFonts w:ascii="Calibri" w:hAnsi="Calibri"/>
-                <w:b/>
-                <w:color w:val="999999"/>
-                <w:sz w:val="22"/>
-                <w:szCs w:val="22"/>
-                <w:lang w:val="fr-FR"/>
-              </w:rPr>
-            </w:pPr>
-          </w:p>
-          <w:p>
-            <w:pPr>
-              <w:ind w:left="360"/>
-              <w:rPr>
-                <w:rFonts w:ascii="Calibri" w:hAnsi="Calibri"/>
-                <w:b/>
-                <w:color w:val="999999"/>
-                <w:sz w:val="22"/>
-                <w:szCs w:val="22"/>
-                <w:lang w:val="fr-FR"/>
-              </w:rPr>
-            </w:pPr>
-          </w:p>
-          <w:p>
-            <w:pPr>
-              <w:ind w:left="360"/>
-              <w:rPr>
-                <w:rFonts w:ascii="Calibri" w:hAnsi="Calibri"/>
-                <w:b/>
-                <w:color w:val="999999"/>
-                <w:sz w:val="22"/>
-                <w:szCs w:val="22"/>
-                <w:lang w:val="fr-FR"/>
-              </w:rPr>
-            </w:pPr>
-          </w:p>
-        </w:tc>
-      </w:tr>
-    </w:tbl>
-    <w:p>
-      <w:pPr>
-        <w:pStyle w:val="2"/>
-        <w:spacing w:before="360" w:after="360"/>
-        <w:jc w:val="center"/>
-        <w:rPr>
-          <w:rFonts w:ascii="Calibri" w:hAnsi="Calibri"/>
-          <w:b/>
-          <w:spacing w:val="40"/>
-          <w:sz w:val="40"/>
-          <w:szCs w:val="40"/>
-        </w:rPr>
-      </w:pPr>
-      <w:r>
-        <w:rPr>
-          <w:rFonts w:ascii="Calibri" w:hAnsi="Calibri"/>
-          <w:b/>
-          <w:spacing w:val="40"/>
-          <w:sz w:val="40"/>
-          <w:szCs w:val="40"/>
-        </w:rPr>
-        <w:t>ΒΕΒΑΙΩΣΗ</w:t>
-      </w:r>
-      <w:r>
-        <w:rPr>
-          <w:rFonts w:ascii="Calibri" w:hAnsi="Calibri"/>
-          <w:b/>
-          <w:spacing w:val="40"/>
-          <w:sz w:val="40"/>
-          <w:szCs w:val="40"/>
-        </w:rPr>
-        <w:t xml:space="preserve"> </w:t>
-      </w:r>
-      <w:r>
-        <w:rPr>
-          <w:rFonts w:ascii="Calibri" w:hAnsi="Calibri"/>
-          <w:b/>
-          <w:spacing w:val="40"/>
-          <w:sz w:val="40"/>
-          <w:szCs w:val="40"/>
-        </w:rPr>
-        <w:t>ΥΛΟΠΟΙΗΣΗΣ ΠΡΟΓΡΑΜΜΑΤΟΣ</w:t>
-      </w:r>
-    </w:p>
-    <w:p>
-      <w:pPr>
-        <w:pStyle w:val="2"/>
-        <w:spacing w:line="480" w:lineRule="auto"/>
-        <w:jc w:val="center"/>
-        <w:rPr>
-          <w:rFonts w:ascii="Calibri" w:hAnsi="Calibri"/>
-          <w:sz w:val="26"/>
-          <w:szCs w:val="26"/>
-        </w:rPr>
-      </w:pPr>
-      <w:r>
-        <w:rPr>
-          <w:rFonts w:ascii="Calibri" w:hAnsi="Calibri"/>
-          <w:sz w:val="26"/>
-          <w:szCs w:val="26"/>
-        </w:rPr>
-        <w:t xml:space="preserve">Βεβαιώνεται ότι κατά το </w:t>
-      </w:r>
-      <w:r>
-        <w:rPr>
-          <w:rFonts w:ascii="Calibri" w:hAnsi="Calibri"/>
-          <w:b/>
-          <w:sz w:val="26"/>
-          <w:szCs w:val="26"/>
-        </w:rPr>
-        <w:t>σχολικό έτος</w:t>
-      </w:r>
-      <w:r>
-        <w:rPr>
-          <w:rFonts w:ascii="Calibri" w:hAnsi="Calibri"/>
-          <w:b/>
-          <w:sz w:val="26"/>
-          <w:szCs w:val="26"/>
-        </w:rPr>
-        <w:t xml:space="preserve"> 2023</w:t>
-      </w:r>
-      <w:r>
-        <w:rPr>
-          <w:rFonts w:ascii="Calibri" w:hAnsi="Calibri"/>
-          <w:b/>
-          <w:sz w:val="26"/>
-          <w:szCs w:val="26"/>
-        </w:rPr>
-        <w:t>-202</w:t>
-      </w:r>
-      <w:r>
-        <w:rPr>
-          <w:rFonts w:ascii="Calibri" w:hAnsi="Calibri"/>
-          <w:b/>
-          <w:sz w:val="26"/>
-          <w:szCs w:val="26"/>
-        </w:rPr>
-        <w:t xml:space="preserve">4 </w:t>
-      </w:r>
-      <w:r>
-        <w:rPr>
-          <w:rFonts w:ascii="Calibri" w:hAnsi="Calibri"/>
-          <w:sz w:val="26"/>
-          <w:szCs w:val="26"/>
-        </w:rPr>
-        <w:t>στη σχολική μονάδα</w:t>
-      </w:r>
-    </w:p>
-    <w:p>
-      <w:pPr>
-        <w:pStyle w:val="2"/>
-        <w:spacing w:line="480" w:lineRule="auto"/>
-        <w:jc w:val="center"/>
-        <w:rPr>
-          <w:rFonts w:ascii="Calibri" w:hAnsi="Calibri"/>
-          <w:b/>
-          <w:sz w:val="26"/>
-          <w:szCs w:val="26"/>
-        </w:rPr>
-      </w:pPr>
-      <w:r>
-        <w:rPr>
-          <w:rFonts w:ascii="Calibri" w:hAnsi="Calibri"/>
-          <w:b/>
-          <w:sz w:val="26"/>
-          <w:szCs w:val="26"/>
-        </w:rPr>
-        <w:t>$</w:t>
-      </w:r>
-      <w:r>
-        <w:rPr>
-          <w:rFonts w:ascii="Calibri" w:hAnsi="Calibri"/>
-          <w:b/>
-          <w:sz w:val="26"/>
-          <w:szCs w:val="26"/>
-        </w:rPr>
-        <w:t>{</w:t>
-      </w:r>
-      <w:r>
-        <w:rPr>
-          <w:rFonts w:ascii="Calibri" w:hAnsi="Calibri"/>
-          <w:b/>
-          <w:sz w:val="26"/>
-          <w:szCs w:val="26"/>
-          <w:lang w:val="en-US"/>
-        </w:rPr>
-        <w:t>s</w:t>
-      </w:r>
-      <w:r>
-        <w:rPr>
-          <w:rFonts w:ascii="Calibri" w:hAnsi="Calibri"/>
-          <w:b/>
-          <w:sz w:val="26"/>
-          <w:szCs w:val="26"/>
-        </w:rPr>
-        <w:t>1</w:t>
-      </w:r>
-      <w:r>
-        <w:rPr>
-          <w:rFonts w:ascii="Calibri" w:hAnsi="Calibri"/>
-          <w:b/>
-          <w:sz w:val="26"/>
-          <w:szCs w:val="26"/>
-          <w:lang w:val="en-US"/>
-        </w:rPr>
-        <w:t>name</w:t>
-      </w:r>
-      <w:r>
-        <w:rPr>
-          <w:rFonts w:ascii="Calibri" w:hAnsi="Calibri"/>
-          <w:b/>
-          <w:sz w:val="26"/>
-          <w:szCs w:val="26"/>
-        </w:rPr>
-        <w:t>}</w:t>
-      </w:r>
-    </w:p>
-    <w:p>
-      <w:pPr>
-        <w:pStyle w:val="2"/>
-        <w:spacing w:line="480" w:lineRule="auto"/>
-        <w:jc w:val="center"/>
-        <w:rPr>
-          <w:rFonts w:ascii="Calibri" w:hAnsi="Calibri"/>
-          <w:sz w:val="26"/>
-          <w:szCs w:val="26"/>
-        </w:rPr>
-      </w:pPr>
-      <w:r>
-        <w:rPr>
-          <w:rFonts w:ascii="Calibri" w:hAnsi="Calibri"/>
-          <w:sz w:val="26"/>
-          <w:szCs w:val="26"/>
-        </w:rPr>
-        <w:t>υλοποιήθηκε πρόγραμμα</w:t>
-      </w:r>
-      <w:r>
-        <w:rPr>
-          <w:rFonts w:ascii="Calibri" w:hAnsi="Calibri"/>
-          <w:sz w:val="26"/>
-          <w:szCs w:val="26"/>
-        </w:rPr>
-        <w:t xml:space="preserve"> </w:t>
-      </w:r>
-      <w:r>
-        <w:rPr>
-          <w:rFonts w:ascii="Calibri" w:hAnsi="Calibri"/>
-          <w:sz w:val="26"/>
-          <w:szCs w:val="26"/>
-        </w:rPr>
-        <w:t>$</w:t>
-      </w:r>
-      <w:r>
-        <w:rPr>
-          <w:rFonts w:ascii="Calibri" w:hAnsi="Calibri"/>
-          <w:sz w:val="26"/>
-          <w:szCs w:val="26"/>
-        </w:rPr>
-        <w:t>{</w:t>
-      </w:r>
-      <w:r>
-        <w:rPr>
-          <w:rFonts w:ascii="Calibri" w:hAnsi="Calibri"/>
-          <w:sz w:val="26"/>
-          <w:szCs w:val="26"/>
-          <w:lang w:val="en-US"/>
-        </w:rPr>
-        <w:t>categ</w:t>
-      </w:r>
-      <w:r>
-        <w:rPr>
-          <w:rFonts w:ascii="Calibri" w:hAnsi="Calibri"/>
-          <w:sz w:val="26"/>
-          <w:szCs w:val="26"/>
-        </w:rPr>
-        <w:t>}</w:t>
-      </w:r>
-      <w:r>
-        <w:rPr>
-          <w:rFonts w:ascii="Calibri" w:hAnsi="Calibri"/>
-          <w:b/>
-          <w:sz w:val="26"/>
-          <w:szCs w:val="26"/>
-        </w:rPr>
-        <w:t xml:space="preserve"> </w:t>
-      </w:r>
-      <w:r>
-        <w:rPr>
-          <w:rFonts w:ascii="Calibri" w:hAnsi="Calibri"/>
-          <w:sz w:val="26"/>
-          <w:szCs w:val="26"/>
-        </w:rPr>
-        <w:t>με</w:t>
-      </w:r>
-      <w:r>
-        <w:rPr>
-          <w:rFonts w:ascii="Calibri" w:hAnsi="Calibri"/>
-          <w:sz w:val="26"/>
-          <w:szCs w:val="26"/>
-        </w:rPr>
-        <w:t xml:space="preserve"> </w:t>
-      </w:r>
-      <w:r>
-        <w:rPr>
-          <w:rFonts w:ascii="Calibri" w:hAnsi="Calibri"/>
-          <w:sz w:val="26"/>
-          <w:szCs w:val="26"/>
-        </w:rPr>
-        <w:t>τίτλο</w:t>
-      </w:r>
-      <w:r>
-        <w:rPr>
-          <w:rFonts w:ascii="Calibri" w:hAnsi="Calibri"/>
-          <w:sz w:val="26"/>
-          <w:szCs w:val="26"/>
-        </w:rPr>
-        <w:t>:</w:t>
-      </w:r>
-    </w:p>
-    <w:p>
-      <w:pPr>
-        <w:pStyle w:val="2"/>
-        <w:spacing w:line="480" w:lineRule="auto"/>
-        <w:jc w:val="center"/>
-        <w:rPr>
-          <w:rFonts w:ascii="Calibri" w:hAnsi="Calibri"/>
-          <w:sz w:val="26"/>
-          <w:szCs w:val="26"/>
-          <w:lang w:val="en-US"/>
-        </w:rPr>
-      </w:pPr>
-      <w:r>
-        <w:rPr>
-          <w:rFonts w:ascii="Calibri" w:hAnsi="Calibri"/>
-          <w:b/>
-          <w:sz w:val="26"/>
-          <w:szCs w:val="26"/>
-          <w:lang w:val="en-US"/>
-        </w:rPr>
-        <w:t>$</w:t>
-      </w:r>
-      <w:r>
-        <w:rPr>
-          <w:rFonts w:ascii="Calibri" w:hAnsi="Calibri"/>
-          <w:b/>
-          <w:sz w:val="26"/>
-          <w:szCs w:val="26"/>
-        </w:rPr>
-        <w:t>{</w:t>
-      </w:r>
-      <w:r>
-        <w:rPr>
-          <w:rFonts w:ascii="Calibri" w:hAnsi="Calibri"/>
-          <w:b/>
-          <w:sz w:val="26"/>
-          <w:szCs w:val="26"/>
-          <w:lang w:val="en-US"/>
-        </w:rPr>
-        <w:t>tite</w:t>
-      </w:r>
-      <w:r>
-        <w:rPr>
-          <w:rFonts w:ascii="Calibri" w:hAnsi="Calibri"/>
-          <w:b/>
-          <w:sz w:val="26"/>
-          <w:szCs w:val="26"/>
-          <w:lang w:val="en-US"/>
-        </w:rPr>
-        <w:t>l</w:t>
-      </w:r>
-      <w:r>
-        <w:rPr>
-          <w:rFonts w:ascii="Calibri" w:hAnsi="Calibri"/>
-          <w:b/>
-          <w:sz w:val="26"/>
-          <w:szCs w:val="26"/>
-        </w:rPr>
-        <w:t>}</w:t>
-      </w:r>
-    </w:p>
-    <w:p>
-      <w:pPr>
-        <w:pStyle w:val="2"/>
-        <w:spacing w:line="480" w:lineRule="auto"/>
-        <w:jc w:val="center"/>
-        <w:rPr>
-          <w:rFonts w:ascii="Calibri" w:hAnsi="Calibri"/>
-          <w:sz w:val="26"/>
-          <w:szCs w:val="26"/>
-        </w:rPr>
-      </w:pPr>
-      <w:r>
-        <w:rPr>
-          <w:rFonts w:ascii="Calibri" w:hAnsi="Calibri"/>
-          <w:sz w:val="26"/>
-          <w:szCs w:val="26"/>
-        </w:rPr>
-        <w:tab/>
-      </w:r>
-      <w:r>
-        <w:rPr>
-          <w:rFonts w:ascii="Calibri" w:hAnsi="Calibri"/>
-          <w:sz w:val="26"/>
-          <w:szCs w:val="26"/>
-        </w:rPr>
-        <w:t>Συντονιστής</w:t>
-      </w:r>
-      <w:r>
-        <w:rPr>
-          <w:rFonts w:ascii="Calibri" w:hAnsi="Calibri"/>
-          <w:sz w:val="26"/>
-          <w:szCs w:val="26"/>
-        </w:rPr>
-        <w:t xml:space="preserve"> του προγράμματο</w:t>
-      </w:r>
-      <w:r>
-        <w:rPr>
-          <w:rFonts w:ascii="Calibri" w:hAnsi="Calibri"/>
-          <w:sz w:val="26"/>
-          <w:szCs w:val="26"/>
-        </w:rPr>
-        <w:t>ς ήταν</w:t>
-      </w:r>
-      <w:r>
-        <w:rPr>
-          <w:rFonts w:ascii="Calibri" w:hAnsi="Calibri"/>
-          <w:sz w:val="26"/>
-          <w:szCs w:val="26"/>
-        </w:rPr>
-        <w:t xml:space="preserve"> ο /η </w:t>
-      </w:r>
-    </w:p>
-    <w:p>
-      <w:pPr>
-        <w:pStyle w:val="2"/>
-        <w:spacing w:line="480" w:lineRule="auto"/>
-        <w:jc w:val="center"/>
-        <w:rPr>
-          <w:rFonts w:ascii="Calibri" w:hAnsi="Calibri"/>
-          <w:b/>
-          <w:sz w:val="26"/>
-          <w:szCs w:val="26"/>
-          <w:lang w:val="en-US"/>
-        </w:rPr>
-      </w:pPr>
-      <w:r>
-        <w:rPr>
-          <w:rFonts w:ascii="Calibri" w:hAnsi="Calibri"/>
-          <w:b/>
-          <w:sz w:val="26"/>
-          <w:szCs w:val="26"/>
-          <w:lang w:val="en-US"/>
-        </w:rPr>
-        <w:t>$</w:t>
-      </w:r>
-      <w:r>
-        <w:rPr>
-          <w:rFonts w:ascii="Calibri" w:hAnsi="Calibri"/>
-          <w:b/>
-          <w:sz w:val="26"/>
-          <w:szCs w:val="26"/>
-        </w:rPr>
-        <w:t>{</w:t>
-      </w:r>
-      <w:r>
-        <w:rPr>
-          <w:rFonts w:ascii="Calibri" w:hAnsi="Calibri"/>
-          <w:b/>
-          <w:sz w:val="26"/>
-          <w:szCs w:val="26"/>
-          <w:lang w:val="en-US"/>
-        </w:rPr>
-        <w:t>nam</w:t>
-      </w:r>
-      <w:r>
-        <w:rPr>
-          <w:rFonts w:ascii="Calibri" w:hAnsi="Calibri"/>
-          <w:b/>
-          <w:sz w:val="26"/>
-          <w:szCs w:val="26"/>
-        </w:rPr>
-        <w:t>1}</w:t>
-      </w:r>
-    </w:p>
-    <w:p>
-      <w:pPr>
-        <w:pStyle w:val="2"/>
-        <w:spacing w:line="480" w:lineRule="auto"/>
-        <w:jc w:val="center"/>
-        <w:rPr>
-          <w:rFonts w:ascii="Calibri" w:hAnsi="Calibri"/>
-          <w:sz w:val="26"/>
-          <w:szCs w:val="26"/>
-        </w:rPr>
-      </w:pPr>
-      <w:r>
-        <w:rPr>
-          <w:rFonts w:ascii="Calibri" w:hAnsi="Calibri"/>
-          <w:sz w:val="26"/>
-          <w:szCs w:val="26"/>
-        </w:rPr>
-        <w:t xml:space="preserve">Συμμετέχοντες στην υλοποίηση του προγράμματος οι εκπαιδευτικοί: </w:t>
-      </w:r>
-    </w:p>
-    <w:p>
-      <w:pPr>
-        <w:pStyle w:val="2"/>
-        <w:spacing w:line="480" w:lineRule="auto"/>
-        <w:jc w:val="center"/>
-        <w:rPr>
-          <w:rFonts w:ascii="Calibri" w:hAnsi="Calibri"/>
-          <w:b/>
-          <w:sz w:val="26"/>
-          <w:szCs w:val="26"/>
-          <w:lang w:val="en-US"/>
-        </w:rPr>
-      </w:pPr>
-      <w:r>
-        <w:rPr>
-          <w:rFonts w:ascii="Calibri" w:hAnsi="Calibri"/>
-          <w:b/>
-          <w:sz w:val="26"/>
-          <w:szCs w:val="26"/>
-          <w:lang w:val="en-US"/>
-        </w:rPr>
-        <w:t>$</w:t>
-      </w:r>
-      <w:r>
-        <w:rPr>
-          <w:rFonts w:ascii="Calibri" w:hAnsi="Calibri"/>
-          <w:b/>
-          <w:sz w:val="26"/>
-          <w:szCs w:val="26"/>
-          <w:lang w:val="en-US"/>
-        </w:rPr>
-        <w:t xml:space="preserve">{nam2}, </w:t>
-      </w:r>
-      <w:r>
-        <w:rPr>
-          <w:rFonts w:ascii="Calibri" w:hAnsi="Calibri"/>
-          <w:b/>
-          <w:sz w:val="26"/>
-          <w:szCs w:val="26"/>
-          <w:lang w:val="en-US"/>
-        </w:rPr>
-        <w:t>$</w:t>
-      </w:r>
-      <w:r>
-        <w:rPr>
-          <w:rFonts w:ascii="Calibri" w:hAnsi="Calibri"/>
-          <w:b/>
-          <w:sz w:val="26"/>
-          <w:szCs w:val="26"/>
-          <w:lang w:val="en-US"/>
-        </w:rPr>
-        <w:t>{nam3}</w:t>
-      </w:r>
-    </w:p>
-    <w:p>
-      <w:pPr>
-        <w:pStyle w:val="2"/>
-        <w:spacing w:line="480" w:lineRule="auto"/>
-        <w:jc w:val="center"/>
-        <w:rPr>
-          <w:rFonts w:ascii="Calibri" w:hAnsi="Calibri"/>
-          <w:sz w:val="26"/>
-          <w:szCs w:val="26"/>
-        </w:rPr>
-      </w:pPr>
-    </w:p>
-    <w:p>
-      <w:pPr>
-        <w:pStyle w:val="2"/>
-        <w:spacing w:line="480" w:lineRule="auto"/>
-        <w:jc w:val="both"/>
-        <w:rPr>
-          <w:rFonts w:ascii="Calibri" w:hAnsi="Calibri"/>
-          <w:sz w:val="26"/>
-          <w:szCs w:val="26"/>
-        </w:rPr>
-      </w:pPr>
-      <w:r>
-        <w:rPr>
-          <w:rFonts w:ascii="Calibri" w:hAnsi="Calibri"/>
-          <w:sz w:val="26"/>
-          <w:szCs w:val="26"/>
-        </w:rPr>
-        <w:tab/>
-      </w:r>
-      <w:r>
-        <w:rPr>
-          <w:rFonts w:ascii="Calibri" w:hAnsi="Calibri"/>
-          <w:sz w:val="26"/>
-          <w:szCs w:val="26"/>
-        </w:rPr>
-        <w:tab/>
-      </w:r>
-      <w:r>
-        <w:rPr>
-          <w:rFonts w:ascii="Calibri" w:hAnsi="Calibri"/>
-          <w:sz w:val="26"/>
-          <w:szCs w:val="26"/>
-        </w:rPr>
-        <w:tab/>
-      </w:r>
-      <w:r>
-        <w:rPr>
-          <w:rFonts w:ascii="Calibri" w:hAnsi="Calibri"/>
-          <w:sz w:val="26"/>
-          <w:szCs w:val="26"/>
-        </w:rPr>
-        <w:tab/>
-      </w:r>
-      <w:r>
-        <w:rPr>
-          <w:rFonts w:ascii="Calibri" w:hAnsi="Calibri"/>
-          <w:sz w:val="26"/>
-          <w:szCs w:val="26"/>
-        </w:rPr>
-        <w:tab/>
-      </w:r>
-      <w:r>
-        <w:rPr>
-          <w:rFonts w:ascii="Calibri" w:hAnsi="Calibri"/>
-          <w:sz w:val="26"/>
-          <w:szCs w:val="26"/>
-        </w:rPr>
-        <w:tab/>
-      </w:r>
-      <w:r>
-        <w:rPr>
-          <w:rFonts w:ascii="Calibri" w:hAnsi="Calibri"/>
-          <w:sz w:val="26"/>
-          <w:szCs w:val="26"/>
-        </w:rPr>
-        <w:tab/>
-      </w:r>
-      <w:r>
-        <w:rPr>
-          <w:noProof/>
-        </w:rPr>
-        <w:drawing>
-          <wp:inline distT="0" distB="0" distL="0" distR="0" wp14:anchorId="66618342" wp14:editId="45F56B85">
-            <wp:extent cx="2437130" cy="1526540"/>
-            <wp:effectExtent l="0" t="0" r="1270" b="0"/>
-            <wp:docPr id="555182882" name="Εικόνα 1"/>
-            <wp:cNvGraphicFramePr>
-              <a:graphicFrameLocks xmlns:a="http://schemas.openxmlformats.org/drawingml/2006/main" noChangeAspect="1"/>
-            </wp:cNvGraphicFramePr>
-            <a:graphic xmlns:a="http://schemas.openxmlformats.org/drawingml/2006/main">
-              <a:graphicData uri="http://schemas.openxmlformats.org/drawingml/2006/picture">
-                <pic:pic xmlns:pic="http://schemas.openxmlformats.org/drawingml/2006/picture">
-                  <pic:nvPicPr>
-                    <pic:cNvPr id="555182882" name="Εικόνα 1"/>
-                    <pic:cNvPicPr>
-                      <a:picLocks noChangeAspect="1"/>
-                    </pic:cNvPicPr>
-                  </pic:nvPicPr>
-                  <pic:blipFill>
-                    <a:blip r:embed="rId9"/>
-                    <a:stretch>
-                      <a:fillRect/>
-                    </a:stretch>
-                  </pic:blipFill>
-                  <pic:spPr>
-                    <a:xfrm>
-                      <a:off x="0" y="0"/>
-                      <a:ext cx="2437130" cy="1526540"/>
-                    </a:xfrm>
-                    <a:prstGeom prst="rect">
-                      <a:avLst/>
-                    </a:prstGeom>
-                  </pic:spPr>
-                </pic:pic>
-              </a:graphicData>
-            </a:graphic>
-          </wp:inline>
-        </w:drawing>
-      </w:r>
-    </w:p>
-    <w:sectPr>
-      <w:pgSz w:w="11906" w:h="16838" w:code="9"/>
-      <w:pgMar w:top="1134" w:right="1134" w:bottom="426" w:left="1134" w:header="709" w:footer="709" w:gutter="0"/>
-      <w:cols w:space="708"/>
-      <w:vAlign w:val="both"/>
-      <w:docGrid w:linePitch="360"/>
-    </w:sectPr>
-  </w:body>
-</w:document>
+<file path=word/document.xml><?xml version="1.0" encoding="UTF-8" standalone="yes"?>
+<w:document xmlns:wpc="http://schemas.microsoft.com/office/word/2010/wordprocessingCanvas" xmlns:cx="http://schemas.microsoft.com/office/drawing/2014/chartex" xmlns:cx1="http://schemas.microsoft.com/office/drawing/2015/9/8/chartex" xmlns:cx2="http://schemas.microsoft.com/office/drawing/2015/10/21/chartex" xmlns:cx3="http://schemas.microsoft.com/office/drawing/2016/5/9/chartex" xmlns:cx4="http://schemas.microsoft.com/office/drawing/2016/5/10/chartex" xmlns:cx5="http://schemas.microsoft.com/office/drawing/2016/5/11/chartex" xmlns:cx6="http://schemas.microsoft.com/office/drawing/2016/5/12/chartex" xmlns:cx7="http://schemas.microsoft.com/office/drawing/2016/5/13/chartex" xmlns:cx8="http://schemas.microsoft.com/office/drawing/2016/5/14/chartex" xmlns:mc="http://schemas.openxmlformats.org/markup-compatibility/2006" xmlns:aink="http://schemas.microsoft.com/office/drawing/2016/ink" xmlns:am3d="http://schemas.microsoft.com/office/drawing/2017/model3d" xmlns:o="urn:schemas-microsoft-com:office:office" xmlns:oel="http://schemas.microsoft.com/office/2019/extlst" xmlns:r="http://schemas.openxmlformats.org/officeDocument/2006/relationships" xmlns:m="http://schemas.openxmlformats.org/officeDocument/2006/math" xmlns:v="urn:schemas-microsoft-com:vml" xmlns:wp14="http://schemas.microsoft.com/office/word/2010/wordprocessingDrawing" xmlns:wp="http://schemas.openxmlformats.org/drawingml/2006/wordprocessingDrawing" xmlns:w10="urn:schemas-microsoft-com:office:word" xmlns:w="http://schemas.openxmlformats.org/wordprocessingml/2006/main" xmlns:w14="http://schemas.microsoft.com/office/word/2010/wordml" xmlns:w15="http://schemas.microsoft.com/office/word/2012/wordml" xmlns:w16cex="http://schemas.microsoft.com/office/word/2018/wordml/cex" xmlns:w16cid="http://schemas.microsoft.com/office/word/2016/wordml/cid" xmlns:w16="http://schemas.microsoft.com/office/word/2018/wordml" xmlns:w16du="http://schemas.microsoft.com/office/word/2023/wordml/word16du" xmlns:w16sdtdh="http://schemas.microsoft.com/office/word/2020/wordml/sdtdatahash" xmlns:w16se="http://schemas.microsoft.com/office/word/2015/wordml/symex" xmlns:wpg="http://schemas.microsoft.com/office/word/2010/wordprocessingGroup" xmlns:wpi="http://schemas.microsoft.com/office/word/2010/wordprocessingInk" xmlns:wne="http://schemas.microsoft.com/office/word/2006/wordml" xmlns:wps="http://schemas.microsoft.com/office/word/2010/wordprocessingShape" mc:Ignorable="w14 w15 w16se w16cid w16 w16cex w16sdtdh w16du wp14"><w:body><w:p/><w:tbl><w:tblPr><w:tblpPr w:leftFromText="180" w:rightFromText="180" w:vertAnchor="page" w:horzAnchor="margin" w:tblpY="1135"/><w:tblW w:w="10468" w:type="dxa"/><w:tblLook w:val="01E0" w:firstRow="1" w:lastRow="1" w:firstColumn="1" w:lastColumn="1" w:noHBand="0" w:noVBand="0"/></w:tblPr><w:tblGrid><w:gridCol w:w="5812"/><w:gridCol w:w="4656"/></w:tblGrid><w:tr><w:tc><w:tcPr><w:tcW w:w="5812" w:type="dxa"/><w:shd w:val="clear" w:color="auto" w:fill="auto"/></w:tcPr><w:p><w:pPr><w:ind w:right="-514"/><w:jc w:val="center"/><w:rPr><w:rFonts w:ascii="Calibri" w:hAnsi="Calibri"/><w:b/><w:sz w:val="22"/><w:szCs w:val="22"/></w:rPr></w:pPr><w:r><w:rPr><w:rFonts w:ascii="Calibri" w:hAnsi="Calibri"/><w:b/></w:rPr><w:t>${protocol_date}</w:t></w:r></w:p><w:p><w:pPr><w:ind w:left="626" w:right="613"/><w:rPr><w:rFonts w:ascii="Calibri" w:hAnsi="Calibri"/><w:b/></w:rPr></w:pPr><w:r><w:rPr><w:rFonts w:ascii="Calibri" w:hAnsi="Calibri"/><w:b/></w:rPr><w:t xml:space="preserve">Αρ. Πρωτ.: </w:t></w:r><w:r><w:rPr><w:rFonts w:ascii="Calibri" w:hAnsi="Calibri"/><w:b/><w:sz w:val="26"/><w:szCs w:val="26"/></w:rPr><w:t xml:space="preserve"> ${sxetos}</w:t></w:r><w:r><w:rPr><w:rFonts w:ascii="Calibri" w:hAnsi="Calibri"/><w:sz w:val="26"/><w:szCs w:val="26"/></w:rPr><w:t>στη σχολική μονάδα</w:t></w:r></w:p><w:p><w:pPr><w:pStyle w:val="2"/><w:spacing w:line="480" w:lineRule="auto"/><w:jc w:val="center"/><w:rPr><w:rFonts w:ascii="Calibri" w:hAnsi="Calibri"/><w:b/><w:sz w:val="26"/><w:szCs w:val="26"/></w:rPr></w:pPr><w:r><w:rPr><w:rFonts w:ascii="Calibri" w:hAnsi="Calibri"/><w:b/><w:sz w:val="26"/><w:szCs w:val="26"/></w:rPr><w:t>$</w:t></w:r><w:r><w:rPr><w:rFonts w:ascii="Calibri" w:hAnsi="Calibri"/><w:b/><w:sz w:val="26"/><w:szCs w:val="26"/></w:rPr><w:t>{</w:t></w:r><w:r><w:rPr><w:rFonts w:ascii="Calibri" w:hAnsi="Calibri"/><w:b/><w:sz w:val="26"/><w:szCs w:val="26"/><w:lang w:val="en-US"/></w:rPr><w:t>s</w:t></w:r><w:r><w:rPr><w:rFonts w:ascii="Calibri" w:hAnsi="Calibri"/><w:b/><w:sz w:val="26"/><w:szCs w:val="26"/></w:rPr><w:t>1</w:t></w:r><w:r><w:rPr><w:rFonts w:ascii="Calibri" w:hAnsi="Calibri"/><w:b/><w:sz w:val="26"/><w:szCs w:val="26"/><w:lang w:val="en-US"/></w:rPr><w:t>name</w:t></w:r><w:r><w:rPr><w:rFonts w:ascii="Calibri" w:hAnsi="Calibri"/><w:b/><w:sz w:val="26"/><w:szCs w:val="26"/></w:rPr><w:t>}</w:t></w:r></w:p><w:p><w:pPr><w:pStyle w:val="2"/><w:spacing w:line="480" w:lineRule="auto"/><w:jc w:val="center"/><w:rPr><w:rFonts w:ascii="Calibri" w:hAnsi="Calibri"/><w:sz w:val="26"/><w:szCs w:val="26"/></w:rPr></w:pPr><w:r><w:rPr><w:rFonts w:ascii="Calibri" w:hAnsi="Calibri"/><w:sz w:val="26"/><w:szCs w:val="26"/></w:rPr><w:t>υλοποιήθηκε πρόγραμμα</w:t></w:r><w:r><w:rPr><w:rFonts w:ascii="Calibri" w:hAnsi="Calibri"/><w:sz w:val="26"/><w:szCs w:val="26"/></w:rPr><w:t xml:space="preserve"> </w:t></w:r><w:r><w:rPr><w:rFonts w:ascii="Calibri" w:hAnsi="Calibri"/><w:sz w:val="26"/><w:szCs w:val="26"/></w:rPr><w:t>$</w:t></w:r><w:r><w:rPr><w:rFonts w:ascii="Calibri" w:hAnsi="Calibri"/><w:sz w:val="26"/><w:szCs w:val="26"/></w:rPr><w:t>{</w:t></w:r><w:r><w:rPr><w:rFonts w:ascii="Calibri" w:hAnsi="Calibri"/><w:sz w:val="26"/><w:szCs w:val="26"/><w:lang w:val="en-US"/></w:rPr><w:t>categ</w:t></w:r><w:r><w:rPr><w:rFonts w:ascii="Calibri" w:hAnsi="Calibri"/><w:sz w:val="26"/><w:szCs w:val="26"/></w:rPr><w:t>}</w:t></w:r><w:r><w:rPr><w:rFonts w:ascii="Calibri" w:hAnsi="Calibri"/><w:b/><w:sz w:val="26"/><w:szCs w:val="26"/></w:rPr><w:t xml:space="preserve"> </w:t></w:r><w:r><w:rPr><w:rFonts w:ascii="Calibri" w:hAnsi="Calibri"/><w:sz w:val="26"/><w:szCs w:val="26"/></w:rPr><w:t>με</w:t></w:r><w:r><w:rPr><w:rFonts w:ascii="Calibri" w:hAnsi="Calibri"/><w:sz w:val="26"/><w:szCs w:val="26"/></w:rPr><w:t xml:space="preserve"> </w:t></w:r><w:r><w:rPr><w:rFonts w:ascii="Calibri" w:hAnsi="Calibri"/><w:sz w:val="26"/><w:szCs w:val="26"/></w:rPr><w:t>τίτλο</w:t></w:r><w:r><w:rPr><w:rFonts w:ascii="Calibri" w:hAnsi="Calibri"/><w:sz w:val="26"/><w:szCs w:val="26"/></w:rPr><w:t>:</w:t></w:r></w:p><w:p><w:pPr><w:pStyle w:val="2"/><w:spacing w:line="480" w:lineRule="auto"/><w:jc w:val="center"/><w:rPr><w:rFonts w:ascii="Calibri" w:hAnsi="Calibri"/><w:sz w:val="26"/><w:szCs w:val="26"/><w:lang w:val="en-US"/></w:rPr></w:pPr><w:r><w:rPr><w:rFonts w:ascii="Calibri" w:hAnsi="Calibri"/><w:b/><w:sz w:val="26"/><w:szCs w:val="26"/><w:lang w:val="en-US"/></w:rPr><w:t>$</w:t></w:r><w:r><w:rPr><w:rFonts w:ascii="Calibri" w:hAnsi="Calibri"/><w:b/><w:sz w:val="26"/><w:szCs w:val="26"/></w:rPr><w:t>{</w:t></w:r><w:r><w:rPr><w:rFonts w:ascii="Calibri" w:hAnsi="Calibri"/><w:b/><w:sz w:val="26"/><w:szCs w:val="26"/><w:lang w:val="en-US"/></w:rPr><w:t>tite</w:t></w:r><w:r><w:rPr><w:rFonts w:ascii="Calibri" w:hAnsi="Calibri"/><w:b/><w:sz w:val="26"/><w:szCs w:val="26"/><w:lang w:val="en-US"/></w:rPr><w:t>l</w:t></w:r><w:r><w:rPr><w:rFonts w:ascii="Calibri" w:hAnsi="Calibri"/><w:b/><w:sz w:val="26"/><w:szCs w:val="26"/></w:rPr><w:t>}</w:t></w:r></w:p><w:p><w:pPr><w:pStyle w:val="2"/><w:spacing w:line="480" w:lineRule="auto"/><w:jc w:val="center"/><w:rPr><w:rFonts w:ascii="Calibri" w:hAnsi="Calibri"/><w:sz w:val="26"/><w:szCs w:val="26"/></w:rPr></w:pPr><w:r><w:rPr><w:rFonts w:ascii="Calibri" w:hAnsi="Calibri"/><w:sz w:val="26"/><w:szCs w:val="26"/></w:rPr><w:tab/></w:r><w:r><w:rPr><w:rFonts w:ascii="Calibri" w:hAnsi="Calibri"/><w:sz w:val="26"/><w:szCs w:val="26"/></w:rPr><w:t>Συντονιστής</w:t></w:r><w:r><w:rPr><w:rFonts w:ascii="Calibri" w:hAnsi="Calibri"/><w:sz w:val="26"/><w:szCs w:val="26"/></w:rPr><w:t xml:space="preserve"> του προγράμματο</w:t></w:r><w:r><w:rPr><w:rFonts w:ascii="Calibri" w:hAnsi="Calibri"/><w:sz w:val="26"/><w:szCs w:val="26"/></w:rPr><w:t>ς ήταν</w:t></w:r><w:r><w:rPr><w:rFonts w:ascii="Calibri" w:hAnsi="Calibri"/><w:sz w:val="26"/><w:szCs w:val="26"/></w:rPr><w:t xml:space="preserve"> ο /η </w:t></w:r></w:p><w:p><w:pPr><w:pStyle w:val="2"/><w:spacing w:line="480" w:lineRule="auto"/><w:jc w:val="center"/><w:rPr><w:rFonts w:ascii="Calibri" w:hAnsi="Calibri"/><w:b/><w:sz w:val="26"/><w:szCs w:val="26"/><w:lang w:val="en-US"/></w:rPr></w:pPr><w:r><w:rPr><w:rFonts w:ascii="Calibri" w:hAnsi="Calibri"/><w:b/><w:sz w:val="26"/><w:szCs w:val="26"/><w:lang w:val="en-US"/></w:rPr><w:t>$</w:t></w:r><w:r><w:rPr><w:rFonts w:ascii="Calibri" w:hAnsi="Calibri"/><w:b/><w:sz w:val="26"/><w:szCs w:val="26"/></w:rPr><w:t>{</w:t></w:r><w:r><w:rPr><w:rFonts w:ascii="Calibri" w:hAnsi="Calibri"/><w:b/><w:sz w:val="26"/><w:szCs w:val="26"/><w:lang w:val="en-US"/></w:rPr><w:t>nam</w:t></w:r><w:r><w:rPr><w:rFonts w:ascii="Calibri" w:hAnsi="Calibri"/><w:b/><w:sz w:val="26"/><w:szCs w:val="26"/></w:rPr><w:t>1}</w:t></w:r></w:p><w:p><w:pPr><w:pStyle w:val="2"/><w:spacing w:line="480" w:lineRule="auto"/><w:jc w:val="center"/><w:rPr><w:rFonts w:ascii="Calibri" w:hAnsi="Calibri"/><w:sz w:val="26"/><w:szCs w:val="26"/></w:rPr></w:pPr><w:r><w:rPr><w:rFonts w:ascii="Calibri" w:hAnsi="Calibri"/><w:sz w:val="26"/><w:szCs w:val="26"/></w:rPr><w:t xml:space="preserve">Συμμετέχοντες στην υλοποίηση του προγράμματος οι εκπαιδευτικοί: </w:t></w:r></w:p><w:p><w:pPr><w:pStyle w:val="2"/><w:spacing w:line="480" w:lineRule="auto"/><w:jc w:val="center"/><w:rPr><w:rFonts w:ascii="Calibri" w:hAnsi="Calibri"/><w:b/><w:sz w:val="26"/><w:szCs w:val="26"/><w:lang w:val="en-US"/></w:rPr></w:pPr><w:r><w:rPr><w:rFonts w:ascii="Calibri" w:hAnsi="Calibri"/><w:b/><w:sz w:val="26"/><w:szCs w:val="26"/><w:lang w:val="en-US"/></w:rPr><w:t>$</w:t></w:r><w:r><w:rPr><w:rFonts w:ascii="Calibri" w:hAnsi="Calibri"/><w:b/><w:sz w:val="26"/><w:szCs w:val="26"/><w:lang w:val="en-US"/></w:rPr><w:t xml:space="preserve">{nam2}, </w:t></w:r><w:r><w:rPr><w:rFonts w:ascii="Calibri" w:hAnsi="Calibri"/><w:b/><w:sz w:val="26"/><w:szCs w:val="26"/><w:lang w:val="en-US"/></w:rPr><w:t>$</w:t></w:r><w:r><w:rPr><w:rFonts w:ascii="Calibri" w:hAnsi="Calibri"/><w:b/><w:sz w:val="26"/><w:szCs w:val="26"/><w:lang w:val="en-US"/></w:rPr><w:t>{nam3}</w:t></w:r></w:p><w:p><w:pPr><w:pStyle w:val="2"/><w:spacing w:line="480" w:lineRule="auto"/><w:jc w:val="center"/><w:rPr><w:rFonts w:ascii="Calibri" w:hAnsi="Calibri"/><w:sz w:val="26"/><w:szCs w:val="26"/></w:rPr></w:pPr></w:p><w:p><w:pPr><w:pStyle w:val="2"/><w:spacing w:line="480" w:lineRule="auto"/><w:jc w:val="both"/><w:rPr><w:rFonts w:ascii="Calibri" w:hAnsi="Calibri"/><w:sz w:val="26"/><w:szCs w:val="26"/></w:rPr></w:pPr><w:r><w:rPr><w:rFonts w:ascii="Calibri" w:hAnsi="Calibri"/><w:sz w:val="26"/><w:szCs w:val="26"/></w:rPr><w:tab/></w:r><w:r><w:rPr><w:rFonts w:ascii="Calibri" w:hAnsi="Calibri"/><w:sz w:val="26"/><w:szCs w:val="26"/></w:rPr><w:tab/></w:r><w:r><w:rPr><w:rFonts w:ascii="Calibri" w:hAnsi="Calibri"/><w:sz w:val="26"/><w:szCs w:val="26"/></w:rPr><w:tab/></w:r><w:r><w:rPr><w:rFonts w:ascii="Calibri" w:hAnsi="Calibri"/><w:sz w:val="26"/><w:szCs w:val="26"/></w:rPr><w:tab/></w:r><w:r><w:rPr><w:rFonts w:ascii="Calibri" w:hAnsi="Calibri"/><w:sz w:val="26"/><w:szCs w:val="26"/></w:rPr><w:tab/></w:r><w:r><w:rPr><w:rFonts w:ascii="Calibri" w:hAnsi="Calibri"/><w:sz w:val="26"/><w:szCs w:val="26"/></w:rPr><w:tab/></w:r><w:r><w:rPr><w:rFonts w:ascii="Calibri" w:hAnsi="Calibri"/><w:sz w:val="26"/><w:szCs w:val="26"/></w:rPr><w:tab/></w:r><w:r><w:rPr><w:noProof/></w:rPr><w:drawing><wp:inline distT="0" distB="0" distL="0" distR="0" wp14:anchorId="66618342" wp14:editId="45F56B85"><wp:extent cx="2437130" cy="1526540"/><wp:effectExtent l="0" t="0" r="1270" b="0"/><wp:docPr id="555182882" name="Εικόνα 1"/><wp:cNvGraphicFramePr><a:graphicFrameLocks xmlns:a="http://schemas.openxmlformats.org/drawingml/2006/main" noChangeAspect="1"/></wp:cNvGraphicFramePr><a:graphic xmlns:a="http://schemas.openxmlformats.org/drawingml/2006/main"><a:graphicData uri="http://schemas.openxmlformats.org/drawingml/2006/picture"><pic:pic xmlns:pic="http://schemas.openxmlformats.org/drawingml/2006/picture"><pic:nvPicPr><pic:cNvPr id="555182882" name="Εικόνα 1"/><pic:cNvPicPr><a:picLocks noChangeAspect="1"/></pic:cNvPicPr></pic:nvPicPr><pic:blipFill><a:blip r:embed="rId9"/><a:stretch><a:fillRect/></a:stretch></pic:blipFill><pic:spPr><a:xfrm><a:off x="0" y="0"/><a:ext cx="2437130" cy="1526540"/></a:xfrm><a:prstGeom prst="rect"><a:avLst/></a:prstGeom></pic:spPr></pic:pic></a:graphicData></a:graphic></wp:inline></w:drawing></w:r></w:p><w:sectPr><w:pgSz w:w="11906" w:h="16838" w:code="9"/><w:pgMar w:top="1134" w:right="1134" w:bottom="426" w:left="1134" w:header="709" w:footer="709" w:gutter="0"/><w:cols w:space="708"/><w:vAlign w:val="both"/><w:docGrid w:linePitch="360"/></w:sectPr></w:body></w:document>
 </file>
 
 <file path=word/numbering.xml><?xml version="1.0" encoding="utf-8"?>

</xml_diff>

<commit_message>
Committed manual placeholders for year-specific metadata in vev_tmpl.docx
</commit_message>
<xml_diff>
--- a/files/vev_tmpl.docx
+++ b/files/vev_tmpl.docx
@@ -1,174 +1,1268 @@
 
-<file path=customXml\item1.xml><?xml version="1.0" encoding="utf-8"?>
-<b:Sources xmlns:b="http://schemas.openxmlformats.org/officeDocument/2006/bibliography" xmlns="http://schemas.openxmlformats.org/officeDocument/2006/bibliography" SelectedStyle="\APASixthEditionOfficeOnline.xsl" StyleName="APA" Version="6"/>
+<file path=word/document.xml><?xml version="1.0" encoding="utf-8"?>
+<w:document xmlns:wpc="http://schemas.microsoft.com/office/word/2010/wordprocessingCanvas" xmlns:cx="http://schemas.microsoft.com/office/drawing/2014/chartex" xmlns:cx1="http://schemas.microsoft.com/office/drawing/2015/9/8/chartex" xmlns:cx2="http://schemas.microsoft.com/office/drawing/2015/10/21/chartex" xmlns:cx3="http://schemas.microsoft.com/office/drawing/2016/5/9/chartex" xmlns:cx4="http://schemas.microsoft.com/office/drawing/2016/5/10/chartex" xmlns:cx5="http://schemas.microsoft.com/office/drawing/2016/5/11/chartex" xmlns:cx6="http://schemas.microsoft.com/office/drawing/2016/5/12/chartex" xmlns:cx7="http://schemas.microsoft.com/office/drawing/2016/5/13/chartex" xmlns:cx8="http://schemas.microsoft.com/office/drawing/2016/5/14/chartex" xmlns:mc="http://schemas.openxmlformats.org/markup-compatibility/2006" xmlns:aink="http://schemas.microsoft.com/office/drawing/2016/ink" xmlns:am3d="http://schemas.microsoft.com/office/drawing/2017/model3d" xmlns:o="urn:schemas-microsoft-com:office:office" xmlns:oel="http://schemas.microsoft.com/office/2019/extlst" xmlns:r="http://schemas.openxmlformats.org/officeDocument/2006/relationships" xmlns:m="http://schemas.openxmlformats.org/officeDocument/2006/math" xmlns:v="urn:schemas-microsoft-com:vml" xmlns:wp14="http://schemas.microsoft.com/office/word/2010/wordprocessingDrawing" xmlns:wp="http://schemas.openxmlformats.org/drawingml/2006/wordprocessingDrawing" xmlns:w10="urn:schemas-microsoft-com:office:word" xmlns:w="http://schemas.openxmlformats.org/wordprocessingml/2006/main" xmlns:w14="http://schemas.microsoft.com/office/word/2010/wordml" xmlns:w15="http://schemas.microsoft.com/office/word/2012/wordml" xmlns:w16cex="http://schemas.microsoft.com/office/word/2018/wordml/cex" xmlns:w16cid="http://schemas.microsoft.com/office/word/2016/wordml/cid" xmlns:w16="http://schemas.microsoft.com/office/word/2018/wordml" xmlns:w16du="http://schemas.microsoft.com/office/word/2023/wordml/word16du" xmlns:w16sdtdh="http://schemas.microsoft.com/office/word/2020/wordml/sdtdatahash" xmlns:w16se="http://schemas.microsoft.com/office/word/2015/wordml/symex" xmlns:wpg="http://schemas.microsoft.com/office/word/2010/wordprocessingGroup" xmlns:wpi="http://schemas.microsoft.com/office/word/2010/wordprocessingInk" xmlns:wne="http://schemas.microsoft.com/office/word/2006/wordml" xmlns:wps="http://schemas.microsoft.com/office/word/2010/wordprocessingShape" mc:Ignorable="w14 w15 w16se w16cid w16 w16cex w16sdtdh wp14">
+  <w:body>
+    <w:p/>
+    <w:tbl>
+      <w:tblPr>
+        <w:tblpPr w:leftFromText="180" w:rightFromText="180" w:vertAnchor="page" w:horzAnchor="margin" w:tblpY="1135"/>
+        <w:tblW w:w="10468" w:type="dxa"/>
+        <w:tblLook w:val="01E0" w:firstRow="1" w:lastRow="1" w:firstColumn="1" w:lastColumn="1" w:noHBand="0" w:noVBand="0"/>
+      </w:tblPr>
+      <w:tblGrid>
+        <w:gridCol w:w="5812"/>
+        <w:gridCol w:w="4656"/>
+      </w:tblGrid>
+      <w:tr>
+        <w:tc>
+          <w:tcPr>
+            <w:tcW w:w="5812" w:type="dxa"/>
+            <w:shd w:val="clear" w:color="auto" w:fill="auto"/>
+          </w:tcPr>
+          <w:p>
+            <w:pPr>
+              <w:ind w:right="-514"/>
+              <w:jc w:val="center"/>
+              <w:rPr>
+                <w:rFonts w:ascii="Calibri" w:hAnsi="Calibri"/>
+                <w:b/>
+                <w:sz w:val="22"/>
+                <w:szCs w:val="22"/>
+              </w:rPr>
+            </w:pPr>
+            <w:r>
+              <w:rPr>
+                <w:rFonts w:ascii="Calibri" w:hAnsi="Calibri"/>
+                <w:b/>
+              </w:rPr>
+              <w:object w:dxaOrig="701" w:dyaOrig="686" w14:anchorId="70D8E824">
+                <v:shapetype id="_x0000_t75" coordsize="21600,21600" o:spt="75" o:preferrelative="t" path="m@4@5l@4@11@9@11@9@5xe" filled="f" stroked="f">
+                  <v:stroke joinstyle="miter"/>
+                  <v:formulas>
+                    <v:f eqn="if lineDrawn pixelLineWidth 0"/>
+                    <v:f eqn="sum @0 1 0"/>
+                    <v:f eqn="sum 0 0 @1"/>
+                    <v:f eqn="prod @2 1 2"/>
+                    <v:f eqn="prod @3 21600 pixelWidth"/>
+                    <v:f eqn="prod @3 21600 pixelHeight"/>
+                    <v:f eqn="sum @0 0 1"/>
+                    <v:f eqn="prod @6 1 2"/>
+                    <v:f eqn="prod @7 21600 pixelWidth"/>
+                    <v:f eqn="sum @8 21600 0"/>
+                    <v:f eqn="prod @7 21600 pixelHeight"/>
+                    <v:f eqn="sum @10 21600 0"/>
+                  </v:formulas>
+                  <v:path o:extrusionok="f" gradientshapeok="t" o:connecttype="rect"/>
+                  <o:lock v:ext="edit" aspectratio="t"/>
+                </v:shapetype>
+                <v:shape id="_x0000_i1025" type="#_x0000_t75" style="width:26.25pt;height:25.5pt" o:ole="" fillcolor="window">
+                  <v:imagedata r:id="rId6" o:title=""/>
+                </v:shape>
+                <o:OLEObject Type="Embed" ProgID="Word.Picture.8" ShapeID="_x0000_i1025" DrawAspect="Content" ObjectID="_1837067081" r:id="rId7"/>
+              </w:object>
+            </w:r>
+          </w:p>
+          <w:p>
+            <w:pPr>
+              <w:ind w:right="-514"/>
+              <w:jc w:val="center"/>
+              <w:rPr>
+                <w:rFonts w:ascii="Calibri" w:hAnsi="Calibri"/>
+                <w:b/>
+              </w:rPr>
+            </w:pPr>
+            <w:r>
+              <w:rPr>
+                <w:rFonts w:ascii="Calibri" w:hAnsi="Calibri"/>
+                <w:b/>
+              </w:rPr>
+              <w:t>ΕΛΛΗΝΙΚΗ ΔΗΜΟΚΡΑΤΙΑ</w:t>
+            </w:r>
+          </w:p>
+          <w:p>
+            <w:pPr>
+              <w:ind w:right="-514"/>
+              <w:jc w:val="center"/>
+              <w:rPr>
+                <w:rFonts w:ascii="Calibri" w:hAnsi="Calibri"/>
+                <w:b/>
+              </w:rPr>
+            </w:pPr>
+            <w:r>
+              <w:rPr>
+                <w:rFonts w:ascii="Calibri" w:hAnsi="Calibri"/>
+                <w:b/>
+              </w:rPr>
+              <w:t>ΥΠΟΥΡΓΕΙΟ ΠΑΙΔΕΙΑΣ</w:t>
+            </w:r>
+            <w:r>
+              <w:rPr>
+                <w:rFonts w:ascii="Calibri" w:hAnsi="Calibri"/>
+                <w:b/>
+              </w:rPr>
+              <w:t xml:space="preserve">, </w:t>
+            </w:r>
+            <w:r>
+              <w:rPr>
+                <w:rFonts w:ascii="Calibri" w:hAnsi="Calibri"/>
+                <w:b/>
+              </w:rPr>
+              <w:t>ΘΡΗΣΚΕΥΜΑΤΩΝ</w:t>
+            </w:r>
+            <w:r>
+              <w:rPr>
+                <w:rFonts w:ascii="Calibri" w:hAnsi="Calibri"/>
+                <w:b/>
+              </w:rPr>
+              <w:t xml:space="preserve"> </w:t>
+            </w:r>
+          </w:p>
+          <w:p>
+            <w:pPr>
+              <w:ind w:right="-514"/>
+              <w:jc w:val="center"/>
+              <w:rPr>
+                <w:rFonts w:ascii="Calibri" w:hAnsi="Calibri"/>
+                <w:b/>
+              </w:rPr>
+            </w:pPr>
+            <w:r>
+              <w:rPr>
+                <w:rFonts w:ascii="Calibri" w:hAnsi="Calibri"/>
+                <w:b/>
+              </w:rPr>
+              <w:t>&amp; ΑΘΛΗΤΙΣΜΟΥ</w:t>
+            </w:r>
+          </w:p>
+          <w:p>
+            <w:pPr>
+              <w:ind w:right="-514"/>
+              <w:rPr>
+                <w:rFonts w:ascii="Calibri" w:hAnsi="Calibri"/>
+                <w:b/>
+              </w:rPr>
+            </w:pPr>
+            <w:r>
+              <w:rPr>
+                <w:rFonts w:ascii="Calibri" w:hAnsi="Calibri"/>
+                <w:b/>
+              </w:rPr>
+              <w:t xml:space="preserve">                       ………………………………………………………..</w:t>
+            </w:r>
+          </w:p>
+          <w:p>
+            <w:pPr>
+              <w:ind w:right="-514"/>
+              <w:jc w:val="center"/>
+              <w:rPr>
+                <w:rFonts w:ascii="Calibri" w:hAnsi="Calibri"/>
+                <w:b/>
+              </w:rPr>
+            </w:pPr>
+            <w:r>
+              <w:rPr>
+                <w:rFonts w:ascii="Calibri" w:hAnsi="Calibri"/>
+                <w:b/>
+              </w:rPr>
+              <w:t>ΠΕΡΙΦΕΡΕΙΑΚΗ Δ/ΝΣΗ Π/ΘΜΙΑΣ</w:t>
+            </w:r>
+          </w:p>
+          <w:p>
+            <w:pPr>
+              <w:ind w:right="-514"/>
+              <w:jc w:val="center"/>
+              <w:rPr>
+                <w:rFonts w:ascii="Calibri" w:hAnsi="Calibri"/>
+                <w:b/>
+              </w:rPr>
+            </w:pPr>
+            <w:r>
+              <w:rPr>
+                <w:rFonts w:ascii="Calibri" w:hAnsi="Calibri"/>
+                <w:b/>
+              </w:rPr>
+              <w:t>&amp;  Β/ΘΜΙΑΣ ΕΚΠ/ΣΗΣ  ΚΡΗΤΗΣ</w:t>
+            </w:r>
+          </w:p>
+          <w:p>
+            <w:pPr>
+              <w:ind w:right="-514"/>
+              <w:jc w:val="center"/>
+              <w:rPr>
+                <w:rFonts w:ascii="Calibri" w:hAnsi="Calibri"/>
+                <w:b/>
+              </w:rPr>
+            </w:pPr>
+            <w:r>
+              <w:rPr>
+                <w:rFonts w:ascii="Calibri" w:hAnsi="Calibri"/>
+                <w:b/>
+              </w:rPr>
+              <w:t>Δ/ΝΣΗ Π/ΘΜΙΑΣ ΕΚΠ/ΣΗΣ ΗΡΑΚΛΕΙΟΥ</w:t>
+            </w:r>
+          </w:p>
+          <w:p>
+            <w:pPr>
+              <w:jc w:val="center"/>
+              <w:rPr>
+                <w:rFonts w:ascii="Calibri" w:hAnsi="Calibri"/>
+                <w:b/>
+                <w:sz w:val="28"/>
+                <w:szCs w:val="28"/>
+              </w:rPr>
+            </w:pPr>
+            <w:r>
+              <w:rPr>
+                <w:rFonts w:ascii="Calibri" w:hAnsi="Calibri"/>
+                <w:b/>
+                <w:sz w:val="28"/>
+                <w:szCs w:val="28"/>
+              </w:rPr>
+              <w:t xml:space="preserve">      </w:t>
+            </w:r>
+            <w:r>
+              <w:rPr>
+                <w:rFonts w:ascii="Calibri" w:hAnsi="Calibri"/>
+                <w:b/>
+                <w:sz w:val="28"/>
+                <w:szCs w:val="28"/>
+              </w:rPr>
+              <w:t>ΤΜΗΜΑ</w:t>
+            </w:r>
+            <w:r>
+              <w:rPr>
+                <w:rFonts w:ascii="Calibri" w:hAnsi="Calibri"/>
+                <w:b/>
+                <w:sz w:val="28"/>
+                <w:szCs w:val="28"/>
+              </w:rPr>
+              <w:t xml:space="preserve"> ΣΧΟΛΙΚΩΝ ΔΡΑΣΤΗΡΙΟΤΗΤΩΝ</w:t>
+            </w:r>
+          </w:p>
+          <w:p>
+            <w:pPr>
+              <w:jc w:val="center"/>
+              <w:rPr>
+                <w:rFonts w:ascii="Calibri" w:hAnsi="Calibri"/>
+                <w:b/>
+                <w:sz w:val="18"/>
+                <w:szCs w:val="18"/>
+              </w:rPr>
+            </w:pPr>
+          </w:p>
+        </w:tc>
+        <w:tc>
+          <w:tcPr>
+            <w:tcW w:w="4656" w:type="dxa"/>
+            <w:shd w:val="clear" w:color="auto" w:fill="auto"/>
+          </w:tcPr>
+          <w:p>
+            <w:pPr>
+              <w:jc w:val="right"/>
+              <w:rPr>
+                <w:rFonts w:ascii="Calibri" w:hAnsi="Calibri"/>
+                <w:b/>
+              </w:rPr>
+            </w:pPr>
+          </w:p>
+          <w:p>
+            <w:pPr>
+              <w:jc w:val="right"/>
+              <w:rPr>
+                <w:rFonts w:ascii="Calibri" w:hAnsi="Calibri"/>
+                <w:b/>
+              </w:rPr>
+            </w:pPr>
+          </w:p>
+          <w:p>
+            <w:pPr>
+              <w:ind w:left="626" w:right="613"/>
+              <w:rPr>
+                <w:rFonts w:ascii="Calibri" w:hAnsi="Calibri"/>
+                <w:b/>
+              </w:rPr>
+            </w:pPr>
+            <w:r>
+              <w:rPr>
+                <w:rFonts w:ascii="Calibri" w:hAnsi="Calibri"/>
+                <w:b/>
+              </w:rPr>
+              <w:t>Ηράκλειο,</w:t>
+            </w:r>
+            <w:r>
+              <w:rPr>
+                <w:rFonts w:ascii="Calibri" w:hAnsi="Calibri"/>
+                <w:b/>
+                <w:lang w:val="en-US"/>
+              </w:rPr>
+              <w:t xml:space="preserve"> </w:t>
+            </w:r>
+            <w:r>
+              <w:rPr>
+                <w:rFonts w:ascii="Calibri" w:hAnsi="Calibri"/>
+                <w:b/>
+                <w:lang w:val="en-US"/>
+              </w:rPr>
+              <w:t>${protocol_date}</w:t>
+            </w:r>
+          </w:p>
+          <w:p>
+            <w:pPr>
+              <w:ind w:left="626" w:right="613"/>
+              <w:rPr>
+                <w:rFonts w:ascii="Calibri" w:hAnsi="Calibri"/>
+                <w:b/>
+              </w:rPr>
+            </w:pPr>
+            <w:r>
+              <w:rPr>
+                <w:rFonts w:ascii="Calibri" w:hAnsi="Calibri"/>
+                <w:b/>
+              </w:rPr>
+              <w:t xml:space="preserve">Αρ. Πρωτ.: </w:t>
+            </w:r>
+            <w:r>
+              <w:rPr>
+                <w:rFonts w:ascii="Calibri" w:hAnsi="Calibri"/>
+                <w:b/>
+              </w:rPr>
+              <w:t>${protocol}</w:t>
+            </w:r>
+          </w:p>
+          <w:p>
+            <w:pPr>
+              <w:ind w:left="1832"/>
+              <w:rPr>
+                <w:rFonts w:ascii="Calibri" w:hAnsi="Calibri"/>
+                <w:b/>
+              </w:rPr>
+            </w:pPr>
+          </w:p>
+          <w:p>
+            <w:pPr>
+              <w:ind w:left="660"/>
+              <w:rPr>
+                <w:rFonts w:ascii="Calibri" w:hAnsi="Calibri"/>
+                <w:b/>
+              </w:rPr>
+            </w:pPr>
+          </w:p>
+        </w:tc>
+      </w:tr>
+      <w:tr>
+        <w:trPr>
+          <w:trHeight w:val="1985"/>
+        </w:trPr>
+        <w:tc>
+          <w:tcPr>
+            <w:tcW w:w="5812" w:type="dxa"/>
+            <w:shd w:val="clear" w:color="auto" w:fill="auto"/>
+          </w:tcPr>
+          <w:p>
+            <w:pPr>
+              <w:rPr>
+                <w:rFonts w:ascii="Calibri" w:hAnsi="Calibri"/>
+              </w:rPr>
+            </w:pPr>
+            <w:r>
+              <w:rPr>
+                <w:rFonts w:ascii="Calibri" w:hAnsi="Calibri"/>
+              </w:rPr>
+              <w:t>Ταχ. Δ/νση     :</w:t>
+            </w:r>
+            <w:r>
+              <w:rPr>
+                <w:rFonts w:ascii="Calibri" w:hAnsi="Calibri"/>
+                <w:b/>
+              </w:rPr>
+              <w:t xml:space="preserve">  </w:t>
+            </w:r>
+            <w:r>
+              <w:rPr>
+                <w:rFonts w:ascii="Calibri" w:hAnsi="Calibri"/>
+              </w:rPr>
+              <w:t>Πιτσουλάκη 73</w:t>
+            </w:r>
+          </w:p>
+          <w:p>
+            <w:pPr>
+              <w:rPr>
+                <w:rFonts w:ascii="Calibri" w:hAnsi="Calibri"/>
+              </w:rPr>
+            </w:pPr>
+            <w:r>
+              <w:rPr>
+                <w:rFonts w:ascii="Calibri" w:hAnsi="Calibri"/>
+              </w:rPr>
+              <w:t>Ταχ. Κώδικας</w:t>
+            </w:r>
+            <w:r>
+              <w:rPr>
+                <w:rFonts w:ascii="Calibri" w:hAnsi="Calibri"/>
+              </w:rPr>
+              <w:t xml:space="preserve"> </w:t>
+            </w:r>
+            <w:r>
+              <w:rPr>
+                <w:rFonts w:ascii="Calibri" w:hAnsi="Calibri"/>
+              </w:rPr>
+              <w:t>:  713 07</w:t>
+            </w:r>
+            <w:r>
+              <w:rPr>
+                <w:rFonts w:ascii="Calibri" w:hAnsi="Calibri"/>
+              </w:rPr>
+              <w:t xml:space="preserve"> Ηράκλειο</w:t>
+            </w:r>
+          </w:p>
+          <w:p>
+            <w:pPr>
+              <w:rPr>
+                <w:rFonts w:ascii="Calibri" w:hAnsi="Calibri"/>
+                <w:lang w:val="en-US"/>
+              </w:rPr>
+            </w:pPr>
+            <w:r>
+              <w:rPr>
+                <w:rFonts w:ascii="Calibri" w:hAnsi="Calibri"/>
+              </w:rPr>
+              <w:t>Τηλέφωνο</w:t>
+            </w:r>
+            <w:r>
+              <w:rPr>
+                <w:rFonts w:ascii="Calibri" w:hAnsi="Calibri"/>
+                <w:lang w:val="en-US"/>
+              </w:rPr>
+              <w:t xml:space="preserve">      :  2810 529313</w:t>
+            </w:r>
+          </w:p>
+          <w:p>
+            <w:pPr>
+              <w:rPr>
+                <w:rFonts w:ascii="Calibri" w:hAnsi="Calibri"/>
+                <w:lang w:val="fr-FR"/>
+              </w:rPr>
+            </w:pPr>
+            <w:r>
+              <w:rPr>
+                <w:rFonts w:ascii="Calibri" w:hAnsi="Calibri"/>
+                <w:lang w:val="de-DE"/>
+              </w:rPr>
+              <w:t>E</w:t>
+            </w:r>
+            <w:r>
+              <w:rPr>
+                <w:rFonts w:ascii="Calibri" w:hAnsi="Calibri"/>
+                <w:lang w:val="fr-FR"/>
+              </w:rPr>
+              <w:t>-</w:t>
+            </w:r>
+            <w:r>
+              <w:rPr>
+                <w:rFonts w:ascii="Calibri" w:hAnsi="Calibri"/>
+                <w:lang w:val="de-DE"/>
+              </w:rPr>
+              <w:t>mail</w:t>
+            </w:r>
+            <w:r>
+              <w:rPr>
+                <w:rFonts w:ascii="Calibri" w:hAnsi="Calibri"/>
+                <w:lang w:val="fr-FR"/>
+              </w:rPr>
+              <w:t xml:space="preserve">             :  </w:t>
+            </w:r>
+            <w:hyperlink r:id="rId8" w:history="1">
+              <w:r>
+                <w:rPr>
+                  <w:rStyle w:val="-"/>
+                  <w:rFonts w:ascii="Calibri" w:hAnsi="Calibri"/>
+                  <w:lang w:val="de-DE"/>
+                </w:rPr>
+                <w:t>tay</w:t>
+              </w:r>
+              <w:r>
+                <w:rPr>
+                  <w:rStyle w:val="-"/>
+                  <w:rFonts w:ascii="Calibri" w:hAnsi="Calibri"/>
+                  <w:lang w:val="fr-FR"/>
+                </w:rPr>
+                <w:t>@</w:t>
+              </w:r>
+              <w:r>
+                <w:rPr>
+                  <w:rStyle w:val="-"/>
+                  <w:rFonts w:ascii="Calibri" w:hAnsi="Calibri"/>
+                  <w:lang w:val="de-DE"/>
+                </w:rPr>
+                <w:t>dipe</w:t>
+              </w:r>
+              <w:r>
+                <w:rPr>
+                  <w:rStyle w:val="-"/>
+                  <w:rFonts w:ascii="Calibri" w:hAnsi="Calibri"/>
+                  <w:lang w:val="fr-FR"/>
+                </w:rPr>
+                <w:t>.</w:t>
+              </w:r>
+              <w:r>
+                <w:rPr>
+                  <w:rStyle w:val="-"/>
+                  <w:rFonts w:ascii="Calibri" w:hAnsi="Calibri"/>
+                  <w:lang w:val="de-DE"/>
+                </w:rPr>
+                <w:t>ira</w:t>
+              </w:r>
+              <w:r>
+                <w:rPr>
+                  <w:rStyle w:val="-"/>
+                  <w:rFonts w:ascii="Calibri" w:hAnsi="Calibri"/>
+                  <w:lang w:val="fr-FR"/>
+                </w:rPr>
+                <w:t>.</w:t>
+              </w:r>
+              <w:r>
+                <w:rPr>
+                  <w:rStyle w:val="-"/>
+                  <w:rFonts w:ascii="Calibri" w:hAnsi="Calibri"/>
+                  <w:lang w:val="de-DE"/>
+                </w:rPr>
+                <w:t>sch</w:t>
+              </w:r>
+              <w:r>
+                <w:rPr>
+                  <w:rStyle w:val="-"/>
+                  <w:rFonts w:ascii="Calibri" w:hAnsi="Calibri"/>
+                  <w:lang w:val="fr-FR"/>
+                </w:rPr>
+                <w:t>.</w:t>
+              </w:r>
+              <w:r>
+                <w:rPr>
+                  <w:rStyle w:val="-"/>
+                  <w:rFonts w:ascii="Calibri" w:hAnsi="Calibri"/>
+                  <w:lang w:val="de-DE"/>
+                </w:rPr>
+                <w:t>gr</w:t>
+              </w:r>
+            </w:hyperlink>
+            <w:r>
+              <w:rPr>
+                <w:rFonts w:ascii="Calibri" w:hAnsi="Calibri"/>
+                <w:lang w:val="fr-FR"/>
+              </w:rPr>
+              <w:t xml:space="preserve"> </w:t>
+            </w:r>
+          </w:p>
+        </w:tc>
+        <w:tc>
+          <w:tcPr>
+            <w:tcW w:w="4656" w:type="dxa"/>
+            <w:shd w:val="clear" w:color="auto" w:fill="auto"/>
+          </w:tcPr>
+          <w:p>
+            <w:pPr>
+              <w:ind w:left="360"/>
+              <w:rPr>
+                <w:rFonts w:ascii="Calibri" w:hAnsi="Calibri"/>
+                <w:b/>
+                <w:color w:val="999999"/>
+                <w:sz w:val="22"/>
+                <w:szCs w:val="22"/>
+                <w:lang w:val="fr-FR"/>
+              </w:rPr>
+            </w:pPr>
+          </w:p>
+          <w:p>
+            <w:pPr>
+              <w:ind w:left="360"/>
+              <w:rPr>
+                <w:rFonts w:ascii="Calibri" w:hAnsi="Calibri"/>
+                <w:b/>
+                <w:color w:val="999999"/>
+                <w:sz w:val="22"/>
+                <w:szCs w:val="22"/>
+                <w:lang w:val="fr-FR"/>
+              </w:rPr>
+            </w:pPr>
+          </w:p>
+          <w:p>
+            <w:pPr>
+              <w:ind w:left="360"/>
+              <w:rPr>
+                <w:rFonts w:ascii="Calibri" w:hAnsi="Calibri"/>
+                <w:b/>
+                <w:color w:val="999999"/>
+                <w:sz w:val="22"/>
+                <w:szCs w:val="22"/>
+                <w:lang w:val="fr-FR"/>
+              </w:rPr>
+            </w:pPr>
+          </w:p>
+          <w:p>
+            <w:pPr>
+              <w:ind w:left="360"/>
+              <w:rPr>
+                <w:rFonts w:ascii="Calibri" w:hAnsi="Calibri"/>
+                <w:b/>
+                <w:color w:val="999999"/>
+                <w:sz w:val="22"/>
+                <w:szCs w:val="22"/>
+                <w:lang w:val="fr-FR"/>
+              </w:rPr>
+            </w:pPr>
+          </w:p>
+        </w:tc>
+      </w:tr>
+    </w:tbl>
+    <w:p>
+      <w:pPr>
+        <w:pStyle w:val="2"/>
+        <w:spacing w:before="360" w:after="360"/>
+        <w:jc w:val="center"/>
+        <w:rPr>
+          <w:rFonts w:ascii="Calibri" w:hAnsi="Calibri"/>
+          <w:b/>
+          <w:spacing w:val="40"/>
+          <w:sz w:val="40"/>
+          <w:szCs w:val="40"/>
+        </w:rPr>
+      </w:pPr>
+      <w:r>
+        <w:rPr>
+          <w:rFonts w:ascii="Calibri" w:hAnsi="Calibri"/>
+          <w:b/>
+          <w:spacing w:val="40"/>
+          <w:sz w:val="40"/>
+          <w:szCs w:val="40"/>
+        </w:rPr>
+        <w:t>ΒΕΒΑΙΩΣΗ</w:t>
+      </w:r>
+      <w:r>
+        <w:rPr>
+          <w:rFonts w:ascii="Calibri" w:hAnsi="Calibri"/>
+          <w:b/>
+          <w:spacing w:val="40"/>
+          <w:sz w:val="40"/>
+          <w:szCs w:val="40"/>
+        </w:rPr>
+        <w:t xml:space="preserve"> </w:t>
+      </w:r>
+      <w:r>
+        <w:rPr>
+          <w:rFonts w:ascii="Calibri" w:hAnsi="Calibri"/>
+          <w:b/>
+          <w:spacing w:val="40"/>
+          <w:sz w:val="40"/>
+          <w:szCs w:val="40"/>
+        </w:rPr>
+        <w:t>ΥΛΟΠΟΙΗΣΗΣ ΠΡΟΓΡΑΜΜΑΤΟΣ</w:t>
+      </w:r>
+    </w:p>
+    <w:p>
+      <w:pPr>
+        <w:pStyle w:val="2"/>
+        <w:spacing w:line="480" w:lineRule="auto"/>
+        <w:jc w:val="center"/>
+        <w:rPr>
+          <w:rFonts w:ascii="Calibri" w:hAnsi="Calibri"/>
+          <w:sz w:val="26"/>
+          <w:szCs w:val="26"/>
+        </w:rPr>
+      </w:pPr>
+      <w:r>
+        <w:rPr>
+          <w:rFonts w:ascii="Calibri" w:hAnsi="Calibri"/>
+          <w:sz w:val="26"/>
+          <w:szCs w:val="26"/>
+        </w:rPr>
+        <w:t xml:space="preserve">Βεβαιώνεται ότι κατά το </w:t>
+      </w:r>
+      <w:r>
+        <w:rPr>
+          <w:rFonts w:ascii="Calibri" w:hAnsi="Calibri"/>
+          <w:b/>
+          <w:sz w:val="26"/>
+          <w:szCs w:val="26"/>
+        </w:rPr>
+        <w:t>σχολικό έτος</w:t>
+      </w:r>
+      <w:r>
+        <w:rPr>
+          <w:rFonts w:ascii="Calibri" w:hAnsi="Calibri"/>
+          <w:b/>
+          <w:sz w:val="26"/>
+          <w:szCs w:val="26"/>
+        </w:rPr>
+        <w:t xml:space="preserve"> </w:t>
+      </w:r>
+      <w:r>
+        <w:rPr>
+          <w:rFonts w:ascii="Calibri" w:hAnsi="Calibri"/>
+          <w:b/>
+          <w:sz w:val="26"/>
+          <w:szCs w:val="26"/>
+        </w:rPr>
+        <w:t>${sxetos}</w:t>
+      </w:r>
+      <w:r>
+        <w:rPr>
+          <w:rFonts w:ascii="Calibri" w:hAnsi="Calibri"/>
+          <w:b/>
+          <w:sz w:val="26"/>
+          <w:szCs w:val="26"/>
+        </w:rPr>
+        <w:t xml:space="preserve"> </w:t>
+      </w:r>
+      <w:r>
+        <w:rPr>
+          <w:rFonts w:ascii="Calibri" w:hAnsi="Calibri"/>
+          <w:sz w:val="26"/>
+          <w:szCs w:val="26"/>
+        </w:rPr>
+        <w:t>στη σχολική μονάδα</w:t>
+      </w:r>
+    </w:p>
+    <w:p>
+      <w:pPr>
+        <w:pStyle w:val="2"/>
+        <w:spacing w:line="480" w:lineRule="auto"/>
+        <w:jc w:val="center"/>
+        <w:rPr>
+          <w:rFonts w:ascii="Calibri" w:hAnsi="Calibri"/>
+          <w:b/>
+          <w:sz w:val="26"/>
+          <w:szCs w:val="26"/>
+        </w:rPr>
+      </w:pPr>
+      <w:r>
+        <w:rPr>
+          <w:rFonts w:ascii="Calibri" w:hAnsi="Calibri"/>
+          <w:b/>
+          <w:sz w:val="26"/>
+          <w:szCs w:val="26"/>
+        </w:rPr>
+        <w:t>$</w:t>
+      </w:r>
+      <w:r>
+        <w:rPr>
+          <w:rFonts w:ascii="Calibri" w:hAnsi="Calibri"/>
+          <w:b/>
+          <w:sz w:val="26"/>
+          <w:szCs w:val="26"/>
+        </w:rPr>
+        <w:t>{</w:t>
+      </w:r>
+      <w:r>
+        <w:rPr>
+          <w:rFonts w:ascii="Calibri" w:hAnsi="Calibri"/>
+          <w:b/>
+          <w:sz w:val="26"/>
+          <w:szCs w:val="26"/>
+          <w:lang w:val="en-US"/>
+        </w:rPr>
+        <w:t>s</w:t>
+      </w:r>
+      <w:r>
+        <w:rPr>
+          <w:rFonts w:ascii="Calibri" w:hAnsi="Calibri"/>
+          <w:b/>
+          <w:sz w:val="26"/>
+          <w:szCs w:val="26"/>
+        </w:rPr>
+        <w:t>1</w:t>
+      </w:r>
+      <w:r>
+        <w:rPr>
+          <w:rFonts w:ascii="Calibri" w:hAnsi="Calibri"/>
+          <w:b/>
+          <w:sz w:val="26"/>
+          <w:szCs w:val="26"/>
+          <w:lang w:val="en-US"/>
+        </w:rPr>
+        <w:t>name</w:t>
+      </w:r>
+      <w:r>
+        <w:rPr>
+          <w:rFonts w:ascii="Calibri" w:hAnsi="Calibri"/>
+          <w:b/>
+          <w:sz w:val="26"/>
+          <w:szCs w:val="26"/>
+        </w:rPr>
+        <w:t>}</w:t>
+      </w:r>
+    </w:p>
+    <w:p>
+      <w:pPr>
+        <w:pStyle w:val="2"/>
+        <w:spacing w:line="480" w:lineRule="auto"/>
+        <w:jc w:val="center"/>
+        <w:rPr>
+          <w:rFonts w:ascii="Calibri" w:hAnsi="Calibri"/>
+          <w:sz w:val="26"/>
+          <w:szCs w:val="26"/>
+        </w:rPr>
+      </w:pPr>
+      <w:r>
+        <w:rPr>
+          <w:rFonts w:ascii="Calibri" w:hAnsi="Calibri"/>
+          <w:sz w:val="26"/>
+          <w:szCs w:val="26"/>
+        </w:rPr>
+        <w:t>υλοποιήθηκε πρόγραμμα</w:t>
+      </w:r>
+      <w:r>
+        <w:rPr>
+          <w:rFonts w:ascii="Calibri" w:hAnsi="Calibri"/>
+          <w:sz w:val="26"/>
+          <w:szCs w:val="26"/>
+        </w:rPr>
+        <w:t xml:space="preserve"> </w:t>
+      </w:r>
+      <w:r>
+        <w:rPr>
+          <w:rFonts w:ascii="Calibri" w:hAnsi="Calibri"/>
+          <w:sz w:val="26"/>
+          <w:szCs w:val="26"/>
+        </w:rPr>
+        <w:t>$</w:t>
+      </w:r>
+      <w:r>
+        <w:rPr>
+          <w:rFonts w:ascii="Calibri" w:hAnsi="Calibri"/>
+          <w:sz w:val="26"/>
+          <w:szCs w:val="26"/>
+        </w:rPr>
+        <w:t>{</w:t>
+      </w:r>
+      <w:r>
+        <w:rPr>
+          <w:rFonts w:ascii="Calibri" w:hAnsi="Calibri"/>
+          <w:sz w:val="26"/>
+          <w:szCs w:val="26"/>
+          <w:lang w:val="en-US"/>
+        </w:rPr>
+        <w:t>categ</w:t>
+      </w:r>
+      <w:r>
+        <w:rPr>
+          <w:rFonts w:ascii="Calibri" w:hAnsi="Calibri"/>
+          <w:sz w:val="26"/>
+          <w:szCs w:val="26"/>
+        </w:rPr>
+        <w:t>}</w:t>
+      </w:r>
+      <w:r>
+        <w:rPr>
+          <w:rFonts w:ascii="Calibri" w:hAnsi="Calibri"/>
+          <w:b/>
+          <w:sz w:val="26"/>
+          <w:szCs w:val="26"/>
+        </w:rPr>
+        <w:t xml:space="preserve"> </w:t>
+      </w:r>
+      <w:r>
+        <w:rPr>
+          <w:rFonts w:ascii="Calibri" w:hAnsi="Calibri"/>
+          <w:sz w:val="26"/>
+          <w:szCs w:val="26"/>
+        </w:rPr>
+        <w:t>με</w:t>
+      </w:r>
+      <w:r>
+        <w:rPr>
+          <w:rFonts w:ascii="Calibri" w:hAnsi="Calibri"/>
+          <w:sz w:val="26"/>
+          <w:szCs w:val="26"/>
+        </w:rPr>
+        <w:t xml:space="preserve"> </w:t>
+      </w:r>
+      <w:r>
+        <w:rPr>
+          <w:rFonts w:ascii="Calibri" w:hAnsi="Calibri"/>
+          <w:sz w:val="26"/>
+          <w:szCs w:val="26"/>
+        </w:rPr>
+        <w:t>τίτλο</w:t>
+      </w:r>
+      <w:r>
+        <w:rPr>
+          <w:rFonts w:ascii="Calibri" w:hAnsi="Calibri"/>
+          <w:sz w:val="26"/>
+          <w:szCs w:val="26"/>
+        </w:rPr>
+        <w:t>:</w:t>
+      </w:r>
+    </w:p>
+    <w:p>
+      <w:pPr>
+        <w:pStyle w:val="2"/>
+        <w:spacing w:line="480" w:lineRule="auto"/>
+        <w:jc w:val="center"/>
+        <w:rPr>
+          <w:rFonts w:ascii="Calibri" w:hAnsi="Calibri"/>
+          <w:sz w:val="26"/>
+          <w:szCs w:val="26"/>
+        </w:rPr>
+      </w:pPr>
+      <w:r>
+        <w:rPr>
+          <w:rFonts w:ascii="Calibri" w:hAnsi="Calibri"/>
+          <w:b/>
+          <w:sz w:val="26"/>
+          <w:szCs w:val="26"/>
+        </w:rPr>
+        <w:t>$</w:t>
+      </w:r>
+      <w:r>
+        <w:rPr>
+          <w:rFonts w:ascii="Calibri" w:hAnsi="Calibri"/>
+          <w:b/>
+          <w:sz w:val="26"/>
+          <w:szCs w:val="26"/>
+        </w:rPr>
+        <w:t>{</w:t>
+      </w:r>
+      <w:r>
+        <w:rPr>
+          <w:rFonts w:ascii="Calibri" w:hAnsi="Calibri"/>
+          <w:b/>
+          <w:sz w:val="26"/>
+          <w:szCs w:val="26"/>
+          <w:lang w:val="en-US"/>
+        </w:rPr>
+        <w:t>tite</w:t>
+      </w:r>
+      <w:r>
+        <w:rPr>
+          <w:rFonts w:ascii="Calibri" w:hAnsi="Calibri"/>
+          <w:b/>
+          <w:sz w:val="26"/>
+          <w:szCs w:val="26"/>
+          <w:lang w:val="en-US"/>
+        </w:rPr>
+        <w:t>l</w:t>
+      </w:r>
+      <w:r>
+        <w:rPr>
+          <w:rFonts w:ascii="Calibri" w:hAnsi="Calibri"/>
+          <w:b/>
+          <w:sz w:val="26"/>
+          <w:szCs w:val="26"/>
+        </w:rPr>
+        <w:t>}</w:t>
+      </w:r>
+    </w:p>
+    <w:p>
+      <w:pPr>
+        <w:pStyle w:val="2"/>
+        <w:spacing w:line="480" w:lineRule="auto"/>
+        <w:jc w:val="center"/>
+        <w:rPr>
+          <w:rFonts w:ascii="Calibri" w:hAnsi="Calibri"/>
+          <w:sz w:val="26"/>
+          <w:szCs w:val="26"/>
+        </w:rPr>
+      </w:pPr>
+      <w:r>
+        <w:rPr>
+          <w:rFonts w:ascii="Calibri" w:hAnsi="Calibri"/>
+          <w:sz w:val="26"/>
+          <w:szCs w:val="26"/>
+        </w:rPr>
+        <w:tab/>
+      </w:r>
+      <w:r>
+        <w:rPr>
+          <w:rFonts w:ascii="Calibri" w:hAnsi="Calibri"/>
+          <w:sz w:val="26"/>
+          <w:szCs w:val="26"/>
+        </w:rPr>
+        <w:t>Συντονιστής</w:t>
+      </w:r>
+      <w:r>
+        <w:rPr>
+          <w:rFonts w:ascii="Calibri" w:hAnsi="Calibri"/>
+          <w:sz w:val="26"/>
+          <w:szCs w:val="26"/>
+        </w:rPr>
+        <w:t xml:space="preserve"> του προγράμματο</w:t>
+      </w:r>
+      <w:r>
+        <w:rPr>
+          <w:rFonts w:ascii="Calibri" w:hAnsi="Calibri"/>
+          <w:sz w:val="26"/>
+          <w:szCs w:val="26"/>
+        </w:rPr>
+        <w:t>ς ήταν</w:t>
+      </w:r>
+      <w:r>
+        <w:rPr>
+          <w:rFonts w:ascii="Calibri" w:hAnsi="Calibri"/>
+          <w:sz w:val="26"/>
+          <w:szCs w:val="26"/>
+        </w:rPr>
+        <w:t xml:space="preserve"> ο /η </w:t>
+      </w:r>
+    </w:p>
+    <w:p>
+      <w:pPr>
+        <w:pStyle w:val="2"/>
+        <w:spacing w:line="480" w:lineRule="auto"/>
+        <w:jc w:val="center"/>
+        <w:rPr>
+          <w:rFonts w:ascii="Calibri" w:hAnsi="Calibri"/>
+          <w:b/>
+          <w:sz w:val="26"/>
+          <w:szCs w:val="26"/>
+        </w:rPr>
+      </w:pPr>
+      <w:r>
+        <w:rPr>
+          <w:rFonts w:ascii="Calibri" w:hAnsi="Calibri"/>
+          <w:b/>
+          <w:sz w:val="26"/>
+          <w:szCs w:val="26"/>
+        </w:rPr>
+        <w:t>$</w:t>
+      </w:r>
+      <w:r>
+        <w:rPr>
+          <w:rFonts w:ascii="Calibri" w:hAnsi="Calibri"/>
+          <w:b/>
+          <w:sz w:val="26"/>
+          <w:szCs w:val="26"/>
+        </w:rPr>
+        <w:t>{</w:t>
+      </w:r>
+      <w:r>
+        <w:rPr>
+          <w:rFonts w:ascii="Calibri" w:hAnsi="Calibri"/>
+          <w:b/>
+          <w:sz w:val="26"/>
+          <w:szCs w:val="26"/>
+          <w:lang w:val="en-US"/>
+        </w:rPr>
+        <w:t>nam</w:t>
+      </w:r>
+      <w:r>
+        <w:rPr>
+          <w:rFonts w:ascii="Calibri" w:hAnsi="Calibri"/>
+          <w:b/>
+          <w:sz w:val="26"/>
+          <w:szCs w:val="26"/>
+        </w:rPr>
+        <w:t>1}</w:t>
+      </w:r>
+    </w:p>
+    <w:p>
+      <w:pPr>
+        <w:pStyle w:val="2"/>
+        <w:spacing w:line="480" w:lineRule="auto"/>
+        <w:jc w:val="center"/>
+        <w:rPr>
+          <w:rFonts w:ascii="Calibri" w:hAnsi="Calibri"/>
+          <w:sz w:val="26"/>
+          <w:szCs w:val="26"/>
+        </w:rPr>
+      </w:pPr>
+      <w:r>
+        <w:rPr>
+          <w:rFonts w:ascii="Calibri" w:hAnsi="Calibri"/>
+          <w:sz w:val="26"/>
+          <w:szCs w:val="26"/>
+        </w:rPr>
+        <w:t xml:space="preserve">Συμμετέχοντες στην υλοποίηση του προγράμματος οι εκπαιδευτικοί: </w:t>
+      </w:r>
+    </w:p>
+    <w:p>
+      <w:pPr>
+        <w:pStyle w:val="2"/>
+        <w:spacing w:line="480" w:lineRule="auto"/>
+        <w:jc w:val="center"/>
+        <w:rPr>
+          <w:rFonts w:ascii="Calibri" w:hAnsi="Calibri"/>
+          <w:b/>
+          <w:sz w:val="26"/>
+          <w:szCs w:val="26"/>
+          <w:lang w:val="en-US"/>
+        </w:rPr>
+      </w:pPr>
+      <w:r>
+        <w:rPr>
+          <w:rFonts w:ascii="Calibri" w:hAnsi="Calibri"/>
+          <w:b/>
+          <w:sz w:val="26"/>
+          <w:szCs w:val="26"/>
+          <w:lang w:val="en-US"/>
+        </w:rPr>
+        <w:t>$</w:t>
+      </w:r>
+      <w:r>
+        <w:rPr>
+          <w:rFonts w:ascii="Calibri" w:hAnsi="Calibri"/>
+          <w:b/>
+          <w:sz w:val="26"/>
+          <w:szCs w:val="26"/>
+          <w:lang w:val="en-US"/>
+        </w:rPr>
+        <w:t xml:space="preserve">{nam2}, </w:t>
+      </w:r>
+      <w:r>
+        <w:rPr>
+          <w:rFonts w:ascii="Calibri" w:hAnsi="Calibri"/>
+          <w:b/>
+          <w:sz w:val="26"/>
+          <w:szCs w:val="26"/>
+          <w:lang w:val="en-US"/>
+        </w:rPr>
+        <w:t>$</w:t>
+      </w:r>
+      <w:r>
+        <w:rPr>
+          <w:rFonts w:ascii="Calibri" w:hAnsi="Calibri"/>
+          <w:b/>
+          <w:sz w:val="26"/>
+          <w:szCs w:val="26"/>
+          <w:lang w:val="en-US"/>
+        </w:rPr>
+        <w:t>{nam3}</w:t>
+      </w:r>
+    </w:p>
+    <w:p>
+      <w:pPr>
+        <w:pStyle w:val="2"/>
+        <w:spacing w:line="480" w:lineRule="auto"/>
+        <w:jc w:val="center"/>
+        <w:rPr>
+          <w:rFonts w:ascii="Calibri" w:hAnsi="Calibri"/>
+          <w:sz w:val="26"/>
+          <w:szCs w:val="26"/>
+        </w:rPr>
+      </w:pPr>
+    </w:p>
+    <w:p>
+      <w:pPr>
+        <w:pStyle w:val="2"/>
+        <w:spacing w:line="480" w:lineRule="auto"/>
+        <w:jc w:val="both"/>
+        <w:rPr>
+          <w:rFonts w:ascii="Calibri" w:hAnsi="Calibri"/>
+          <w:sz w:val="26"/>
+          <w:szCs w:val="26"/>
+        </w:rPr>
+      </w:pPr>
+      <w:r>
+        <w:rPr>
+          <w:rFonts w:ascii="Calibri" w:hAnsi="Calibri"/>
+          <w:sz w:val="26"/>
+          <w:szCs w:val="26"/>
+        </w:rPr>
+        <w:tab/>
+      </w:r>
+      <w:r>
+        <w:rPr>
+          <w:rFonts w:ascii="Calibri" w:hAnsi="Calibri"/>
+          <w:sz w:val="26"/>
+          <w:szCs w:val="26"/>
+        </w:rPr>
+        <w:tab/>
+      </w:r>
+      <w:r>
+        <w:rPr>
+          <w:rFonts w:ascii="Calibri" w:hAnsi="Calibri"/>
+          <w:sz w:val="26"/>
+          <w:szCs w:val="26"/>
+        </w:rPr>
+        <w:tab/>
+      </w:r>
+      <w:r>
+        <w:rPr>
+          <w:rFonts w:ascii="Calibri" w:hAnsi="Calibri"/>
+          <w:sz w:val="26"/>
+          <w:szCs w:val="26"/>
+        </w:rPr>
+        <w:tab/>
+      </w:r>
+      <w:r>
+        <w:rPr>
+          <w:rFonts w:ascii="Calibri" w:hAnsi="Calibri"/>
+          <w:sz w:val="26"/>
+          <w:szCs w:val="26"/>
+        </w:rPr>
+        <w:tab/>
+      </w:r>
+      <w:r>
+        <w:rPr>
+          <w:rFonts w:ascii="Calibri" w:hAnsi="Calibri"/>
+          <w:sz w:val="26"/>
+          <w:szCs w:val="26"/>
+        </w:rPr>
+        <w:tab/>
+      </w:r>
+      <w:r>
+        <w:rPr>
+          <w:rFonts w:ascii="Calibri" w:hAnsi="Calibri"/>
+          <w:sz w:val="26"/>
+          <w:szCs w:val="26"/>
+        </w:rPr>
+        <w:tab/>
+      </w:r>
+      <w:r>
+        <w:rPr>
+          <w:noProof/>
+        </w:rPr>
+        <w:drawing>
+          <wp:inline distT="0" distB="0" distL="0" distR="0" wp14:anchorId="66618342" wp14:editId="45F56B85">
+            <wp:extent cx="2437130" cy="1526540"/>
+            <wp:effectExtent l="0" t="0" r="1270" b="0"/>
+            <wp:docPr id="555182882" name="Εικόνα 1"/>
+            <wp:cNvGraphicFramePr>
+              <a:graphicFrameLocks xmlns:a="http://schemas.openxmlformats.org/drawingml/2006/main" noChangeAspect="1"/>
+            </wp:cNvGraphicFramePr>
+            <a:graphic xmlns:a="http://schemas.openxmlformats.org/drawingml/2006/main">
+              <a:graphicData uri="http://schemas.openxmlformats.org/drawingml/2006/picture">
+                <pic:pic xmlns:pic="http://schemas.openxmlformats.org/drawingml/2006/picture">
+                  <pic:nvPicPr>
+                    <pic:cNvPr id="555182882" name="Εικόνα 1"/>
+                    <pic:cNvPicPr>
+                      <a:picLocks noChangeAspect="1"/>
+                    </pic:cNvPicPr>
+                  </pic:nvPicPr>
+                  <pic:blipFill>
+                    <a:blip r:embed="rId9"/>
+                    <a:stretch>
+                      <a:fillRect/>
+                    </a:stretch>
+                  </pic:blipFill>
+                  <pic:spPr>
+                    <a:xfrm>
+                      <a:off x="0" y="0"/>
+                      <a:ext cx="2437130" cy="1526540"/>
+                    </a:xfrm>
+                    <a:prstGeom prst="rect">
+                      <a:avLst/>
+                    </a:prstGeom>
+                  </pic:spPr>
+                </pic:pic>
+              </a:graphicData>
+            </a:graphic>
+          </wp:inline>
+        </w:drawing>
+      </w:r>
+    </w:p>
+    <w:sectPr>
+      <w:pgSz w:w="11906" w:h="16838" w:code="9"/>
+      <w:pgMar w:top="1134" w:right="1134" w:bottom="426" w:left="1134" w:header="709" w:footer="709" w:gutter="0"/>
+      <w:cols w:space="708"/>
+      <w:vAlign w:val="both"/>
+      <w:docGrid w:linePitch="360"/>
+    </w:sectPr>
+  </w:body>
+</w:document>
 </file>
 
-<file path=customXml\itemProps1.xml><?xml version="1.0" encoding="utf-8"?>
-<ds:datastoreItem xmlns:ds="http://schemas.openxmlformats.org/officeDocument/2006/customXml" ds:itemID="{293F71A8-E919-4C81-A031-EA8923EBF774}">
-  <ds:schemaRefs>
-    <ds:schemaRef ds:uri="http://schemas.openxmlformats.org/officeDocument/2006/bibliography"/>
-  </ds:schemaRefs>
-</ds:datastoreItem>
-</file>
-
-<file path=docProps\app.xml><?xml version="1.0" encoding="utf-8"?>
-<Properties xmlns="http://schemas.openxmlformats.org/officeDocument/2006/extended-properties" xmlns:vt="http://schemas.openxmlformats.org/officeDocument/2006/docPropsVTypes">
-  <Template>Normal.dotm</Template>
-  <TotalTime>92</TotalTime>
-  <Pages>1</Pages>
-  <Words>123</Words>
-  <Characters>668</Characters>
-  <Application>Microsoft Office Word</Application>
-  <DocSecurity>0</DocSecurity>
-  <Lines>5</Lines>
-  <Paragraphs>1</Paragraphs>
-  <ScaleCrop>false</ScaleCrop>
-  <HeadingPairs>
-    <vt:vector size="4" baseType="variant">
-      <vt:variant>
-        <vt:lpstr>Τίτλος</vt:lpstr>
-      </vt:variant>
-      <vt:variant>
-        <vt:i4>1</vt:i4>
-      </vt:variant>
-      <vt:variant>
-        <vt:lpstr>Title</vt:lpstr>
-      </vt:variant>
-      <vt:variant>
-        <vt:i4>1</vt:i4>
-      </vt:variant>
-    </vt:vector>
-  </HeadingPairs>
-  <TitlesOfParts>
-    <vt:vector size="2" baseType="lpstr">
-      <vt:lpstr/>
-      <vt:lpstr> </vt:lpstr>
-    </vt:vector>
-  </TitlesOfParts>
-  <Company>Co</Company>
-  <LinksUpToDate>false</LinksUpToDate>
-  <CharactersWithSpaces>790</CharactersWithSpaces>
-  <SharedDoc>false</SharedDoc>
-  <HLinks>
-    <vt:vector size="6" baseType="variant">
-      <vt:variant>
-        <vt:i4>3538963</vt:i4>
-      </vt:variant>
-      <vt:variant>
-        <vt:i4>3</vt:i4>
-      </vt:variant>
-      <vt:variant>
-        <vt:i4>0</vt:i4>
-      </vt:variant>
-      <vt:variant>
-        <vt:i4>5</vt:i4>
-      </vt:variant>
-      <vt:variant>
-        <vt:lpwstr>mailto:tay@dipe.ira.sch.gr</vt:lpwstr>
-      </vt:variant>
-      <vt:variant>
-        <vt:lpwstr/>
-      </vt:variant>
-    </vt:vector>
-  </HLinks>
-  <HyperlinksChanged>false</HyperlinksChanged>
-  <AppVersion>16.0000</AppVersion>
-</Properties>
-</file>
-
-<file path=docProps\core.xml><?xml version="1.0" encoding="utf-8"?>
-<cp:coreProperties xmlns:cp="http://schemas.openxmlformats.org/package/2006/metadata/core-properties" xmlns:dc="http://purl.org/dc/elements/1.1/" xmlns:dcterms="http://purl.org/dc/terms/" xmlns:dcmitype="http://purl.org/dc/dcmitype/" xmlns:xsi="http://www.w3.org/2001/XMLSchema-instance">
-  <dc:creator>user</dc:creator>
-  <cp:lastModifiedBy>Vangelis Sugar</cp:lastModifiedBy>
-  <cp:revision>34</cp:revision>
-  <cp:lastPrinted>2018-06-05T09:22:00Z</cp:lastPrinted>
-  <dcterms:created xsi:type="dcterms:W3CDTF">2020-07-01T07:03:00Z</dcterms:created>
-  <dcterms:modified xsi:type="dcterms:W3CDTF">2024-09-23T09:08:00Z</dcterms:modified>
-</cp:coreProperties>
-</file>
-
-<file path=word\document.xml><?xml version="1.0"?>
-
-</file>
-
-<file path=word\fontTable.xml><?xml version="1.0" encoding="utf-8"?>
-<w:fonts xmlns:mc="http://schemas.openxmlformats.org/markup-compatibility/2006" xmlns:r="http://schemas.openxmlformats.org/officeDocument/2006/relationships" xmlns:w="http://schemas.openxmlformats.org/wordprocessingml/2006/main" xmlns:w14="http://schemas.microsoft.com/office/word/2010/wordml" xmlns:w15="http://schemas.microsoft.com/office/word/2012/wordml" xmlns:w16cex="http://schemas.microsoft.com/office/word/2018/wordml/cex" xmlns:w16cid="http://schemas.microsoft.com/office/word/2016/wordml/cid" xmlns:w16="http://schemas.microsoft.com/office/word/2018/wordml" xmlns:w16du="http://schemas.microsoft.com/office/word/2023/wordml/word16du" xmlns:w16sdtdh="http://schemas.microsoft.com/office/word/2020/wordml/sdtdatahash" xmlns:w16se="http://schemas.microsoft.com/office/word/2015/wordml/symex" mc:Ignorable="w14 w15 w16se w16cid w16 w16cex w16sdtdh w16du">
-  <w:font w:name="Symbol">
-    <w:panose1 w:val="05050102010706020507"/>
-    <w:charset w:val="02"/>
-    <w:family w:val="roman"/>
-    <w:pitch w:val="variable"/>
-    <w:sig w:usb0="00000000" w:usb1="10000000" w:usb2="00000000" w:usb3="00000000" w:csb0="80000000" w:csb1="00000000"/>
-  </w:font>
-  <w:font w:name="Times New Roman">
-    <w:panose1 w:val="02020603050405020304"/>
-    <w:charset w:val="A1"/>
-    <w:family w:val="roman"/>
-    <w:pitch w:val="variable"/>
-    <w:sig w:usb0="E0002EFF" w:usb1="C000785B" w:usb2="00000009" w:usb3="00000000" w:csb0="000001FF" w:csb1="00000000"/>
-  </w:font>
-  <w:font w:name="Courier New">
-    <w:panose1 w:val="02070309020205020404"/>
-    <w:charset w:val="A1"/>
-    <w:family w:val="modern"/>
-    <w:pitch w:val="fixed"/>
-    <w:sig w:usb0="E0002EFF" w:usb1="C0007843" w:usb2="00000009" w:usb3="00000000" w:csb0="000001FF" w:csb1="00000000"/>
-  </w:font>
-  <w:font w:name="Wingdings">
-    <w:panose1 w:val="05000000000000000000"/>
-    <w:charset w:val="02"/>
-    <w:family w:val="auto"/>
-    <w:pitch w:val="variable"/>
-    <w:sig w:usb0="00000000" w:usb1="10000000" w:usb2="00000000" w:usb3="00000000" w:csb0="80000000" w:csb1="00000000"/>
-  </w:font>
-  <w:font w:name="Calibri Light">
-    <w:panose1 w:val="020F0302020204030204"/>
-    <w:charset w:val="A1"/>
-    <w:family w:val="swiss"/>
-    <w:pitch w:val="variable"/>
-    <w:sig w:usb0="E4002EFF" w:usb1="C000247B" w:usb2="00000009" w:usb3="00000000" w:csb0="000001FF" w:csb1="00000000"/>
-  </w:font>
-  <w:font w:name="Arial">
-    <w:panose1 w:val="020B0604020202020204"/>
-    <w:charset w:val="A1"/>
-    <w:family w:val="swiss"/>
-    <w:pitch w:val="variable"/>
-    <w:sig w:usb0="E0002EFF" w:usb1="C000785B" w:usb2="00000009" w:usb3="00000000" w:csb0="000001FF" w:csb1="00000000"/>
-  </w:font>
-  <w:font w:name="Bookman Old Style">
-    <w:panose1 w:val="02050604050505020204"/>
-    <w:charset w:val="A1"/>
-    <w:family w:val="roman"/>
-    <w:pitch w:val="variable"/>
-    <w:sig w:usb0="00000287" w:usb1="00000000" w:usb2="00000000" w:usb3="00000000" w:csb0="0000009F" w:csb1="00000000"/>
-  </w:font>
-  <w:font w:name="Tahoma">
-    <w:panose1 w:val="020B0604030504040204"/>
-    <w:charset w:val="00"/>
-    <w:family w:val="swiss"/>
-    <w:notTrueType/>
-    <w:pitch w:val="variable"/>
-    <w:sig w:usb0="00000003" w:usb1="00000000" w:usb2="00000000" w:usb3="00000000" w:csb0="00000001" w:csb1="00000000"/>
-  </w:font>
-  <w:font w:name="Verdana">
-    <w:panose1 w:val="020B0604030504040204"/>
-    <w:charset w:val="A1"/>
-    <w:family w:val="swiss"/>
-    <w:pitch w:val="variable"/>
-    <w:sig w:usb0="A10006FF" w:usb1="4000205B" w:usb2="00000010" w:usb3="00000000" w:csb0="0000019F" w:csb1="00000000"/>
-  </w:font>
-  <w:font w:name="Calibri">
-    <w:panose1 w:val="020F0502020204030204"/>
-    <w:charset w:val="A1"/>
-    <w:family w:val="swiss"/>
-    <w:pitch w:val="variable"/>
-    <w:sig w:usb0="E4002EFF" w:usb1="C000247B" w:usb2="00000009" w:usb3="00000000" w:csb0="000001FF" w:csb1="00000000"/>
-  </w:font>
-</w:fonts>
-</file>
-
-<file path=word\numbering.xml><?xml version="1.0" encoding="utf-8"?>
-<w:numbering xmlns:wpc="http://schemas.microsoft.com/office/word/2010/wordprocessingCanvas" xmlns:cx="http://schemas.microsoft.com/office/drawing/2014/chartex" xmlns:cx1="http://schemas.microsoft.com/office/drawing/2015/9/8/chartex" xmlns:cx2="http://schemas.microsoft.com/office/drawing/2015/10/21/chartex" xmlns:cx3="http://schemas.microsoft.com/office/drawing/2016/5/9/chartex" xmlns:cx4="http://schemas.microsoft.com/office/drawing/2016/5/10/chartex" xmlns:cx5="http://schemas.microsoft.com/office/drawing/2016/5/11/chartex" xmlns:cx6="http://schemas.microsoft.com/office/drawing/2016/5/12/chartex" xmlns:cx7="http://schemas.microsoft.com/office/drawing/2016/5/13/chartex" xmlns:cx8="http://schemas.microsoft.com/office/drawing/2016/5/14/chartex" xmlns:mc="http://schemas.openxmlformats.org/markup-compatibility/2006" xmlns:aink="http://schemas.microsoft.com/office/drawing/2016/ink" xmlns:am3d="http://schemas.microsoft.com/office/drawing/2017/model3d" xmlns:o="urn:schemas-microsoft-com:office:office" xmlns:oel="http://schemas.microsoft.com/office/2019/extlst" xmlns:r="http://schemas.openxmlformats.org/officeDocument/2006/relationships" xmlns:m="http://schemas.openxmlformats.org/officeDocument/2006/math" xmlns:v="urn:schemas-microsoft-com:vml" xmlns:wp14="http://schemas.microsoft.com/office/word/2010/wordprocessingDrawing" xmlns:wp="http://schemas.openxmlformats.org/drawingml/2006/wordprocessingDrawing" xmlns:w10="urn:schemas-microsoft-com:office:word" xmlns:w="http://schemas.openxmlformats.org/wordprocessingml/2006/main" xmlns:w14="http://schemas.microsoft.com/office/word/2010/wordml" xmlns:w15="http://schemas.microsoft.com/office/word/2012/wordml" xmlns:w16cex="http://schemas.microsoft.com/office/word/2018/wordml/cex" xmlns:w16cid="http://schemas.microsoft.com/office/word/2016/wordml/cid" xmlns:w16="http://schemas.microsoft.com/office/word/2018/wordml" xmlns:w16du="http://schemas.microsoft.com/office/word/2023/wordml/word16du" xmlns:w16sdtdh="http://schemas.microsoft.com/office/word/2020/wordml/sdtdatahash" xmlns:w16se="http://schemas.microsoft.com/office/word/2015/wordml/symex" xmlns:wpg="http://schemas.microsoft.com/office/word/2010/wordprocessingGroup" xmlns:wpi="http://schemas.microsoft.com/office/word/2010/wordprocessingInk" xmlns:wne="http://schemas.microsoft.com/office/word/2006/wordml" xmlns:wps="http://schemas.microsoft.com/office/word/2010/wordprocessingShape" mc:Ignorable="w14 w15 w16se w16cid w16 w16cex w16sdtdh w16du wp14">
+<file path=word/numbering.xml><?xml version="1.0" encoding="utf-8"?>
+<w:numbering xmlns:wpc="http://schemas.microsoft.com/office/word/2010/wordprocessingCanvas" xmlns:cx="http://schemas.microsoft.com/office/drawing/2014/chartex" xmlns:cx1="http://schemas.microsoft.com/office/drawing/2015/9/8/chartex" xmlns:cx2="http://schemas.microsoft.com/office/drawing/2015/10/21/chartex" xmlns:cx3="http://schemas.microsoft.com/office/drawing/2016/5/9/chartex" xmlns:cx4="http://schemas.microsoft.com/office/drawing/2016/5/10/chartex" xmlns:cx5="http://schemas.microsoft.com/office/drawing/2016/5/11/chartex" xmlns:cx6="http://schemas.microsoft.com/office/drawing/2016/5/12/chartex" xmlns:cx7="http://schemas.microsoft.com/office/drawing/2016/5/13/chartex" xmlns:cx8="http://schemas.microsoft.com/office/drawing/2016/5/14/chartex" xmlns:mc="http://schemas.openxmlformats.org/markup-compatibility/2006" xmlns:aink="http://schemas.microsoft.com/office/drawing/2016/ink" xmlns:am3d="http://schemas.microsoft.com/office/drawing/2017/model3d" xmlns:o="urn:schemas-microsoft-com:office:office" xmlns:oel="http://schemas.microsoft.com/office/2019/extlst" xmlns:r="http://schemas.openxmlformats.org/officeDocument/2006/relationships" xmlns:m="http://schemas.openxmlformats.org/officeDocument/2006/math" xmlns:v="urn:schemas-microsoft-com:vml" xmlns:wp14="http://schemas.microsoft.com/office/word/2010/wordprocessingDrawing" xmlns:wp="http://schemas.openxmlformats.org/drawingml/2006/wordprocessingDrawing" xmlns:w10="urn:schemas-microsoft-com:office:word" xmlns:w="http://schemas.openxmlformats.org/wordprocessingml/2006/main" xmlns:w14="http://schemas.microsoft.com/office/word/2010/wordml" xmlns:w15="http://schemas.microsoft.com/office/word/2012/wordml" xmlns:w16cex="http://schemas.microsoft.com/office/word/2018/wordml/cex" xmlns:w16cid="http://schemas.microsoft.com/office/word/2016/wordml/cid" xmlns:w16="http://schemas.microsoft.com/office/word/2018/wordml" xmlns:w16du="http://schemas.microsoft.com/office/word/2023/wordml/word16du" xmlns:w16sdtdh="http://schemas.microsoft.com/office/word/2020/wordml/sdtdatahash" xmlns:w16se="http://schemas.microsoft.com/office/word/2015/wordml/symex" xmlns:wpg="http://schemas.microsoft.com/office/word/2010/wordprocessingGroup" xmlns:wpi="http://schemas.microsoft.com/office/word/2010/wordprocessingInk" xmlns:wne="http://schemas.microsoft.com/office/word/2006/wordml" xmlns:wps="http://schemas.microsoft.com/office/word/2010/wordprocessingShape" mc:Ignorable="w14 w15 w16se w16cid w16 w16cex w16sdtdh wp14">
   <w:abstractNum w:abstractNumId="0" w15:restartNumberingAfterBreak="0">
     <w:nsid w:val="089A21B6"/>
     <w:multiLevelType w:val="hybridMultilevel"/>
@@ -930,367 +2024,8 @@
 </w:numbering>
 </file>
 
-<file path=word\settings.xml><?xml version="1.0" encoding="utf-8"?>
-<w:settings xmlns:mc="http://schemas.openxmlformats.org/markup-compatibility/2006" xmlns:o="urn:schemas-microsoft-com:office:office" xmlns:r="http://schemas.openxmlformats.org/officeDocument/2006/relationships" xmlns:m="http://schemas.openxmlformats.org/officeDocument/2006/math" xmlns:v="urn:schemas-microsoft-com:vml" xmlns:w10="urn:schemas-microsoft-com:office:word" xmlns:w="http://schemas.openxmlformats.org/wordprocessingml/2006/main" xmlns:w14="http://schemas.microsoft.com/office/word/2010/wordml" xmlns:w15="http://schemas.microsoft.com/office/word/2012/wordml" xmlns:w16cex="http://schemas.microsoft.com/office/word/2018/wordml/cex" xmlns:w16cid="http://schemas.microsoft.com/office/word/2016/wordml/cid" xmlns:w16="http://schemas.microsoft.com/office/word/2018/wordml" xmlns:w16du="http://schemas.microsoft.com/office/word/2023/wordml/word16du" xmlns:w16sdtdh="http://schemas.microsoft.com/office/word/2020/wordml/sdtdatahash" xmlns:w16se="http://schemas.microsoft.com/office/word/2015/wordml/symex" xmlns:sl="http://schemas.openxmlformats.org/schemaLibrary/2006/main" mc:Ignorable="w14 w15 w16se w16cid w16 w16cex w16sdtdh w16du">
-  <w:zoom w:percent="100"/>
-  <w:embedSystemFonts/>
-  <w:stylePaneFormatFilter w:val="3F01" w:allStyles="1" w:customStyles="0" w:latentStyles="0" w:stylesInUse="0" w:headingStyles="0" w:numberingStyles="0" w:tableStyles="0" w:directFormattingOnRuns="1" w:directFormattingOnParagraphs="1" w:directFormattingOnNumbering="1" w:directFormattingOnTables="1" w:clearFormatting="1" w:top3HeadingStyles="1" w:visibleStyles="0" w:alternateStyleNames="0"/>
-  <w:defaultTabStop w:val="720"/>
-  <w:noPunctuationKerning/>
-  <w:characterSpacingControl w:val="doNotCompress"/>
-  <w:compat>
-    <w:compatSetting w:name="compatibilityMode" w:uri="http://schemas.microsoft.com/office/word" w:val="12"/>
-    <w:compatSetting w:name="useWord2013TrackBottomHyphenation" w:uri="http://schemas.microsoft.com/office/word" w:val="1"/>
-  </w:compat>
-  <w:rsids>
-    <w:rsidRoot w:val="007635E8"/>
-    <w:rsid w:val="00016E1E"/>
-    <w:rsid w:val="0002019D"/>
-    <w:rsid w:val="0002099E"/>
-    <w:rsid w:val="000266D2"/>
-    <w:rsid w:val="000365EE"/>
-    <w:rsid w:val="00037650"/>
-    <w:rsid w:val="00037D7D"/>
-    <w:rsid w:val="000432DF"/>
-    <w:rsid w:val="00045D23"/>
-    <w:rsid w:val="00052188"/>
-    <w:rsid w:val="00055079"/>
-    <w:rsid w:val="000828FF"/>
-    <w:rsid w:val="00083D29"/>
-    <w:rsid w:val="000866A9"/>
-    <w:rsid w:val="000910F7"/>
-    <w:rsid w:val="00094BD6"/>
-    <w:rsid w:val="0009705F"/>
-    <w:rsid w:val="000B09AB"/>
-    <w:rsid w:val="000B12A3"/>
-    <w:rsid w:val="000B6125"/>
-    <w:rsid w:val="000D2BFE"/>
-    <w:rsid w:val="000F492A"/>
-    <w:rsid w:val="00104A56"/>
-    <w:rsid w:val="00133F4A"/>
-    <w:rsid w:val="00151F79"/>
-    <w:rsid w:val="001522A9"/>
-    <w:rsid w:val="00160C40"/>
-    <w:rsid w:val="0016174A"/>
-    <w:rsid w:val="0016539D"/>
-    <w:rsid w:val="00165ED3"/>
-    <w:rsid w:val="00170095"/>
-    <w:rsid w:val="00182432"/>
-    <w:rsid w:val="001860EF"/>
-    <w:rsid w:val="001B455A"/>
-    <w:rsid w:val="001B58C3"/>
-    <w:rsid w:val="001C292C"/>
-    <w:rsid w:val="002018AC"/>
-    <w:rsid w:val="0020211A"/>
-    <w:rsid w:val="00224861"/>
-    <w:rsid w:val="00242CB1"/>
-    <w:rsid w:val="00244622"/>
-    <w:rsid w:val="00251D54"/>
-    <w:rsid w:val="0025687D"/>
-    <w:rsid w:val="00267B0A"/>
-    <w:rsid w:val="00281D58"/>
-    <w:rsid w:val="0028224F"/>
-    <w:rsid w:val="00282696"/>
-    <w:rsid w:val="00284C0A"/>
-    <w:rsid w:val="00284C46"/>
-    <w:rsid w:val="00295CC2"/>
-    <w:rsid w:val="00296369"/>
-    <w:rsid w:val="002B24CB"/>
-    <w:rsid w:val="002C20E4"/>
-    <w:rsid w:val="002C2ABE"/>
-    <w:rsid w:val="002C6DDE"/>
-    <w:rsid w:val="002D4640"/>
-    <w:rsid w:val="002E0F80"/>
-    <w:rsid w:val="002E3807"/>
-    <w:rsid w:val="002F7F1C"/>
-    <w:rsid w:val="00305217"/>
-    <w:rsid w:val="003163BB"/>
-    <w:rsid w:val="003328A6"/>
-    <w:rsid w:val="003347B2"/>
-    <w:rsid w:val="003352A3"/>
-    <w:rsid w:val="00336719"/>
-    <w:rsid w:val="00340379"/>
-    <w:rsid w:val="00354714"/>
-    <w:rsid w:val="003703EA"/>
-    <w:rsid w:val="00383C25"/>
-    <w:rsid w:val="003A14CD"/>
-    <w:rsid w:val="003B5631"/>
-    <w:rsid w:val="003B7E58"/>
-    <w:rsid w:val="003C6810"/>
-    <w:rsid w:val="003C7BB8"/>
-    <w:rsid w:val="003D1430"/>
-    <w:rsid w:val="003D3B53"/>
-    <w:rsid w:val="003D562B"/>
-    <w:rsid w:val="003F0B27"/>
-    <w:rsid w:val="003F6741"/>
-    <w:rsid w:val="00405891"/>
-    <w:rsid w:val="00412555"/>
-    <w:rsid w:val="00414582"/>
-    <w:rsid w:val="004213EC"/>
-    <w:rsid w:val="00441903"/>
-    <w:rsid w:val="0044291A"/>
-    <w:rsid w:val="0044729F"/>
-    <w:rsid w:val="00452DDB"/>
-    <w:rsid w:val="00456F6C"/>
-    <w:rsid w:val="00460B82"/>
-    <w:rsid w:val="00460FCF"/>
-    <w:rsid w:val="00462EEC"/>
-    <w:rsid w:val="00471DAB"/>
-    <w:rsid w:val="0048521D"/>
-    <w:rsid w:val="004857D2"/>
-    <w:rsid w:val="004A48B1"/>
-    <w:rsid w:val="004A5F88"/>
-    <w:rsid w:val="004A64A8"/>
-    <w:rsid w:val="004A7EF3"/>
-    <w:rsid w:val="004B46AB"/>
-    <w:rsid w:val="004B472A"/>
-    <w:rsid w:val="004D2B02"/>
-    <w:rsid w:val="004D67EF"/>
-    <w:rsid w:val="004D72A0"/>
-    <w:rsid w:val="004E05EB"/>
-    <w:rsid w:val="004F4885"/>
-    <w:rsid w:val="0050177E"/>
-    <w:rsid w:val="0052441B"/>
-    <w:rsid w:val="00525B46"/>
-    <w:rsid w:val="00530CDD"/>
-    <w:rsid w:val="0053108D"/>
-    <w:rsid w:val="0053710C"/>
-    <w:rsid w:val="0054428A"/>
-    <w:rsid w:val="00562544"/>
-    <w:rsid w:val="00565441"/>
-    <w:rsid w:val="0057149C"/>
-    <w:rsid w:val="0058162D"/>
-    <w:rsid w:val="0059101E"/>
-    <w:rsid w:val="005A10C7"/>
-    <w:rsid w:val="005A2F91"/>
-    <w:rsid w:val="005A4D88"/>
-    <w:rsid w:val="005C0EBC"/>
-    <w:rsid w:val="005C4480"/>
-    <w:rsid w:val="005D3054"/>
-    <w:rsid w:val="005E3CEE"/>
-    <w:rsid w:val="005F1CA3"/>
-    <w:rsid w:val="005F1F55"/>
-    <w:rsid w:val="00601BED"/>
-    <w:rsid w:val="00603C3B"/>
-    <w:rsid w:val="006074F2"/>
-    <w:rsid w:val="00616903"/>
-    <w:rsid w:val="00621B10"/>
-    <w:rsid w:val="006276ED"/>
-    <w:rsid w:val="00644D73"/>
-    <w:rsid w:val="00651C59"/>
-    <w:rsid w:val="006527E6"/>
-    <w:rsid w:val="00674FEE"/>
-    <w:rsid w:val="006872F7"/>
-    <w:rsid w:val="00687B0C"/>
-    <w:rsid w:val="00694FA7"/>
-    <w:rsid w:val="006B214C"/>
-    <w:rsid w:val="006C4042"/>
-    <w:rsid w:val="006D0A04"/>
-    <w:rsid w:val="006D0E33"/>
-    <w:rsid w:val="006D465E"/>
-    <w:rsid w:val="006D5B01"/>
-    <w:rsid w:val="006D67FA"/>
-    <w:rsid w:val="006D75FD"/>
-    <w:rsid w:val="006D7BE9"/>
-    <w:rsid w:val="006E2B6F"/>
-    <w:rsid w:val="00702F78"/>
-    <w:rsid w:val="00723CE2"/>
-    <w:rsid w:val="00733333"/>
-    <w:rsid w:val="00743A85"/>
-    <w:rsid w:val="007635E8"/>
-    <w:rsid w:val="00763862"/>
-    <w:rsid w:val="00797E82"/>
-    <w:rsid w:val="007A1F81"/>
-    <w:rsid w:val="007B79EF"/>
-    <w:rsid w:val="007B7FC2"/>
-    <w:rsid w:val="007C2971"/>
-    <w:rsid w:val="007C41C2"/>
-    <w:rsid w:val="007C47A3"/>
-    <w:rsid w:val="007D798D"/>
-    <w:rsid w:val="007F142A"/>
-    <w:rsid w:val="007F2718"/>
-    <w:rsid w:val="007F4BDD"/>
-    <w:rsid w:val="0080281C"/>
-    <w:rsid w:val="00813BA0"/>
-    <w:rsid w:val="00836974"/>
-    <w:rsid w:val="008448F3"/>
-    <w:rsid w:val="0085674C"/>
-    <w:rsid w:val="008677EF"/>
-    <w:rsid w:val="008755EF"/>
-    <w:rsid w:val="008960B1"/>
-    <w:rsid w:val="008A089B"/>
-    <w:rsid w:val="008A3D35"/>
-    <w:rsid w:val="008A521E"/>
-    <w:rsid w:val="008A59E1"/>
-    <w:rsid w:val="008B624A"/>
-    <w:rsid w:val="008C76D3"/>
-    <w:rsid w:val="008E2510"/>
-    <w:rsid w:val="008E70C4"/>
-    <w:rsid w:val="008F04D6"/>
-    <w:rsid w:val="008F6798"/>
-    <w:rsid w:val="00902810"/>
-    <w:rsid w:val="00922DDB"/>
-    <w:rsid w:val="00923D32"/>
-    <w:rsid w:val="00926A5A"/>
-    <w:rsid w:val="00937264"/>
-    <w:rsid w:val="009457B2"/>
-    <w:rsid w:val="009505D6"/>
-    <w:rsid w:val="009539F6"/>
-    <w:rsid w:val="00957ACC"/>
-    <w:rsid w:val="009602B7"/>
-    <w:rsid w:val="00965FC0"/>
-    <w:rsid w:val="00971330"/>
-    <w:rsid w:val="00974524"/>
-    <w:rsid w:val="009A1E51"/>
-    <w:rsid w:val="009A20A5"/>
-    <w:rsid w:val="009A29A3"/>
-    <w:rsid w:val="009A5BFF"/>
-    <w:rsid w:val="009B21A3"/>
-    <w:rsid w:val="009C533E"/>
-    <w:rsid w:val="009C5CF1"/>
-    <w:rsid w:val="009D4F0B"/>
-    <w:rsid w:val="00A0028E"/>
-    <w:rsid w:val="00A0457A"/>
-    <w:rsid w:val="00A1177F"/>
-    <w:rsid w:val="00A20E36"/>
-    <w:rsid w:val="00A30C8F"/>
-    <w:rsid w:val="00A34F20"/>
-    <w:rsid w:val="00A54C85"/>
-    <w:rsid w:val="00A577CA"/>
-    <w:rsid w:val="00A9412C"/>
-    <w:rsid w:val="00AA2F06"/>
-    <w:rsid w:val="00AB620E"/>
-    <w:rsid w:val="00AC3031"/>
-    <w:rsid w:val="00AD3F7E"/>
-    <w:rsid w:val="00AE3D83"/>
-    <w:rsid w:val="00AF4BD8"/>
-    <w:rsid w:val="00AF7392"/>
-    <w:rsid w:val="00B04E1D"/>
-    <w:rsid w:val="00B153D1"/>
-    <w:rsid w:val="00B155A9"/>
-    <w:rsid w:val="00B3596A"/>
-    <w:rsid w:val="00B802B5"/>
-    <w:rsid w:val="00B80AF7"/>
-    <w:rsid w:val="00B84E84"/>
-    <w:rsid w:val="00B9494D"/>
-    <w:rsid w:val="00BE33BC"/>
-    <w:rsid w:val="00BE5239"/>
-    <w:rsid w:val="00BF2F11"/>
-    <w:rsid w:val="00BF6850"/>
-    <w:rsid w:val="00BF7C4A"/>
-    <w:rsid w:val="00C0068D"/>
-    <w:rsid w:val="00C125CC"/>
-    <w:rsid w:val="00C20206"/>
-    <w:rsid w:val="00C25AAC"/>
-    <w:rsid w:val="00C33F38"/>
-    <w:rsid w:val="00C3450B"/>
-    <w:rsid w:val="00C44161"/>
-    <w:rsid w:val="00C621E8"/>
-    <w:rsid w:val="00C62773"/>
-    <w:rsid w:val="00C64AB3"/>
-    <w:rsid w:val="00C66B75"/>
-    <w:rsid w:val="00C73B2C"/>
-    <w:rsid w:val="00C746C4"/>
-    <w:rsid w:val="00C80BEE"/>
-    <w:rsid w:val="00CB2655"/>
-    <w:rsid w:val="00CC17E5"/>
-    <w:rsid w:val="00CC40F0"/>
-    <w:rsid w:val="00CD2DAC"/>
-    <w:rsid w:val="00CE347C"/>
-    <w:rsid w:val="00D04947"/>
-    <w:rsid w:val="00D4293F"/>
-    <w:rsid w:val="00D479CB"/>
-    <w:rsid w:val="00D71800"/>
-    <w:rsid w:val="00D82D17"/>
-    <w:rsid w:val="00D91D7F"/>
-    <w:rsid w:val="00D956C8"/>
-    <w:rsid w:val="00DB4ECB"/>
-    <w:rsid w:val="00DC2CB8"/>
-    <w:rsid w:val="00DC4A8E"/>
-    <w:rsid w:val="00DC77F1"/>
-    <w:rsid w:val="00DE2538"/>
-    <w:rsid w:val="00DE2703"/>
-    <w:rsid w:val="00DE5E44"/>
-    <w:rsid w:val="00DF3D06"/>
-    <w:rsid w:val="00E10FEF"/>
-    <w:rsid w:val="00E413B4"/>
-    <w:rsid w:val="00E435E0"/>
-    <w:rsid w:val="00E43EBE"/>
-    <w:rsid w:val="00E60678"/>
-    <w:rsid w:val="00E627AD"/>
-    <w:rsid w:val="00E64227"/>
-    <w:rsid w:val="00E678CC"/>
-    <w:rsid w:val="00E82858"/>
-    <w:rsid w:val="00E95F85"/>
-    <w:rsid w:val="00EB1A88"/>
-    <w:rsid w:val="00EB2F9A"/>
-    <w:rsid w:val="00EB61E1"/>
-    <w:rsid w:val="00ED0AD7"/>
-    <w:rsid w:val="00EE40A9"/>
-    <w:rsid w:val="00F018AC"/>
-    <w:rsid w:val="00F023E4"/>
-    <w:rsid w:val="00F12305"/>
-    <w:rsid w:val="00F132EF"/>
-    <w:rsid w:val="00F13D4E"/>
-    <w:rsid w:val="00F176F3"/>
-    <w:rsid w:val="00F25C96"/>
-    <w:rsid w:val="00F26934"/>
-    <w:rsid w:val="00F32CAB"/>
-    <w:rsid w:val="00F355F5"/>
-    <w:rsid w:val="00F46A27"/>
-    <w:rsid w:val="00F5156E"/>
-    <w:rsid w:val="00F525A6"/>
-    <w:rsid w:val="00F70E9B"/>
-    <w:rsid w:val="00F841F5"/>
-    <w:rsid w:val="00FA0166"/>
-    <w:rsid w:val="00FA2060"/>
-    <w:rsid w:val="00FA2ABF"/>
-    <w:rsid w:val="00FA55A7"/>
-    <w:rsid w:val="00FA6F0D"/>
-    <w:rsid w:val="00FA76AC"/>
-    <w:rsid w:val="00FB3BCA"/>
-    <w:rsid w:val="00FB545B"/>
-    <w:rsid w:val="00FC72DB"/>
-    <w:rsid w:val="00FE20A6"/>
-    <w:rsid w:val="00FE3963"/>
-    <w:rsid w:val="00FE6012"/>
-    <w:rsid w:val="00FE6499"/>
-    <w:rsid w:val="00FF2784"/>
-    <w:rsid w:val="00FF5586"/>
-    <w:rsid w:val="00FF5AFC"/>
-    <w:rsid w:val="00FF7372"/>
-  </w:rsids>
-  <m:mathPr>
-    <m:mathFont m:val="Cambria Math"/>
-    <m:brkBin m:val="before"/>
-    <m:brkBinSub m:val="--"/>
-    <m:smallFrac/>
-    <m:dispDef/>
-    <m:lMargin m:val="0"/>
-    <m:rMargin m:val="0"/>
-    <m:defJc m:val="centerGroup"/>
-    <m:wrapIndent m:val="1440"/>
-    <m:intLim m:val="subSup"/>
-    <m:naryLim m:val="undOvr"/>
-  </m:mathPr>
-  <w:themeFontLang w:val="el-GR"/>
-  <w:clrSchemeMapping w:bg1="light1" w:t1="dark1" w:bg2="light2" w:t2="dark2" w:accent1="accent1" w:accent2="accent2" w:accent3="accent3" w:accent4="accent4" w:accent5="accent5" w:accent6="accent6" w:hyperlink="hyperlink" w:followedHyperlink="followedHyperlink"/>
-  <w:doNotIncludeSubdocsInStats/>
-  <w:shapeDefaults>
-    <o:shapedefaults v:ext="edit" spidmax="1026"/>
-    <o:shapelayout v:ext="edit">
-      <o:idmap v:ext="edit" data="1"/>
-    </o:shapelayout>
-  </w:shapeDefaults>
-  <w:decimalSymbol w:val=","/>
-  <w:listSeparator w:val=";"/>
-  <w14:docId w14:val="7D07C6C4"/>
-  <w15:docId w15:val="{B33728E0-9EFA-47FF-A1CA-E564E133C972}"/>
-</w:settings>
-</file>
-
-<file path=word\styles.xml><?xml version="1.0" encoding="utf-8"?>
-<w:styles xmlns:mc="http://schemas.openxmlformats.org/markup-compatibility/2006" xmlns:r="http://schemas.openxmlformats.org/officeDocument/2006/relationships" xmlns:w="http://schemas.openxmlformats.org/wordprocessingml/2006/main" xmlns:w14="http://schemas.microsoft.com/office/word/2010/wordml" xmlns:w15="http://schemas.microsoft.com/office/word/2012/wordml" xmlns:w16cex="http://schemas.microsoft.com/office/word/2018/wordml/cex" xmlns:w16cid="http://schemas.microsoft.com/office/word/2016/wordml/cid" xmlns:w16="http://schemas.microsoft.com/office/word/2018/wordml" xmlns:w16du="http://schemas.microsoft.com/office/word/2023/wordml/word16du" xmlns:w16sdtdh="http://schemas.microsoft.com/office/word/2020/wordml/sdtdatahash" xmlns:w16se="http://schemas.microsoft.com/office/word/2015/wordml/symex" mc:Ignorable="w14 w15 w16se w16cid w16 w16cex w16sdtdh w16du">
+<file path=word/styles.xml><?xml version="1.0" encoding="utf-8"?>
+<w:styles xmlns:mc="http://schemas.openxmlformats.org/markup-compatibility/2006" xmlns:r="http://schemas.openxmlformats.org/officeDocument/2006/relationships" xmlns:w="http://schemas.openxmlformats.org/wordprocessingml/2006/main" xmlns:w14="http://schemas.microsoft.com/office/word/2010/wordml" xmlns:w15="http://schemas.microsoft.com/office/word/2012/wordml" xmlns:w16cex="http://schemas.microsoft.com/office/word/2018/wordml/cex" xmlns:w16cid="http://schemas.microsoft.com/office/word/2016/wordml/cid" xmlns:w16="http://schemas.microsoft.com/office/word/2018/wordml" xmlns:w16sdtdh="http://schemas.microsoft.com/office/word/2020/wordml/sdtdatahash" xmlns:w16se="http://schemas.microsoft.com/office/word/2015/wordml/symex" mc:Ignorable="w14 w15 w16se w16cid w16 w16cex w16sdtdh">
   <w:docDefaults>
     <w:rPrDefault>
       <w:rPr>
@@ -1862,7 +2597,7 @@
 </w:styles>
 </file>
 
-<file path=word\theme\theme1.xml><?xml version="1.0" encoding="utf-8"?>
+<file path=word/theme/theme1.xml><?xml version="1.0" encoding="utf-8"?>
 <a:theme xmlns:a="http://schemas.openxmlformats.org/drawingml/2006/main" name="Θέμα του Office">
   <a:themeElements>
     <a:clrScheme name="Office">
@@ -2123,25 +2858,14 @@
 </a:theme>
 </file>
 
-<file path=word\webSettings.xml><?xml version="1.0" encoding="utf-8"?>
-<w:webSettings xmlns:mc="http://schemas.openxmlformats.org/markup-compatibility/2006" xmlns:r="http://schemas.openxmlformats.org/officeDocument/2006/relationships" xmlns:w="http://schemas.openxmlformats.org/wordprocessingml/2006/main" xmlns:w14="http://schemas.microsoft.com/office/word/2010/wordml" xmlns:w15="http://schemas.microsoft.com/office/word/2012/wordml" xmlns:w16cex="http://schemas.microsoft.com/office/word/2018/wordml/cex" xmlns:w16cid="http://schemas.microsoft.com/office/word/2016/wordml/cid" xmlns:w16="http://schemas.microsoft.com/office/word/2018/wordml" xmlns:w16du="http://schemas.microsoft.com/office/word/2023/wordml/word16du" xmlns:w16sdtdh="http://schemas.microsoft.com/office/word/2020/wordml/sdtdatahash" xmlns:w16se="http://schemas.microsoft.com/office/word/2015/wordml/symex" mc:Ignorable="w14 w15 w16se w16cid w16 w16cex w16sdtdh w16du">
-  <w:divs>
-    <w:div w:id="1697349419">
-      <w:bodyDiv w:val="1"/>
-      <w:marLeft w:val="0"/>
-      <w:marRight w:val="0"/>
-      <w:marTop w:val="0"/>
-      <w:marBottom w:val="0"/>
-      <w:divBdr>
-        <w:top w:val="none" w:sz="0" w:space="0" w:color="auto"/>
-        <w:left w:val="none" w:sz="0" w:space="0" w:color="auto"/>
-        <w:bottom w:val="none" w:sz="0" w:space="0" w:color="auto"/>
-        <w:right w:val="none" w:sz="0" w:space="0" w:color="auto"/>
-      </w:divBdr>
-    </w:div>
-  </w:divs>
-  <w:optimizeForBrowser/>
-  <w:relyOnVML/>
-  <w:allowPNG/>
-</w:webSettings>
+<file path=customXml/item1.xml><?xml version="1.0" encoding="utf-8"?>
+<b:Sources xmlns:b="http://schemas.openxmlformats.org/officeDocument/2006/bibliography" xmlns="http://schemas.openxmlformats.org/officeDocument/2006/bibliography" SelectedStyle="\APASixthEditionOfficeOnline.xsl" StyleName="APA" Version="6"/>
+</file>
+
+<file path=customXml/itemProps1.xml><?xml version="1.0" encoding="utf-8"?>
+<ds:datastoreItem xmlns:ds="http://schemas.openxmlformats.org/officeDocument/2006/customXml" ds:itemID="{293F71A8-E919-4C81-A031-EA8923EBF774}">
+  <ds:schemaRefs>
+    <ds:schemaRef ds:uri="http://schemas.openxmlformats.org/officeDocument/2006/bibliography"/>
+  </ds:schemaRefs>
+</ds:datastoreItem>
 </file>
</xml_diff>

<commit_message>
refactor: update telephone number in certificate template
</commit_message>
<xml_diff>
--- a/files/vev_tmpl.docx
+++ b/files/vev_tmpl.docx
@@ -58,7 +58,7 @@
                 <v:shape id="_x0000_i1025" type="#_x0000_t75" style="width:26.25pt;height:25.5pt" o:ole="" fillcolor="window">
                   <v:imagedata r:id="rId6" o:title=""/>
                 </v:shape>
-                <o:OLEObject Type="Embed" ProgID="Word.Picture.8" ShapeID="_x0000_i1025" DrawAspect="Content" ObjectID="_1837067081" r:id="rId7"/>
+                <o:OLEObject Type="Embed" ProgID="Word.Picture.8" ShapeID="_x0000_i1025" DrawAspect="Content" ObjectID="_1845095884" r:id="rId7"/>
               </w:object>
             </w:r>
           </w:p>
@@ -293,9 +293,30 @@
               <w:rPr>
                 <w:rFonts w:ascii="Calibri" w:hAnsi="Calibri"/>
                 <w:b/>
+              </w:rPr>
+              <w:t xml:space="preserve"> </w:t>
+            </w:r>
+            <w:r>
+              <w:rPr>
+                <w:rFonts w:ascii="Calibri" w:hAnsi="Calibri"/>
+                <w:b/>
+              </w:rPr>
+              <w:t>${</w:t>
+            </w:r>
+            <w:r>
+              <w:rPr>
+                <w:rFonts w:ascii="Calibri" w:hAnsi="Calibri"/>
+                <w:b/>
                 <w:lang w:val="en-US"/>
               </w:rPr>
-              <w:t xml:space="preserve"> </w:t>
+              <w:t>protocol</w:t>
+            </w:r>
+            <w:r>
+              <w:rPr>
+                <w:rFonts w:ascii="Calibri" w:hAnsi="Calibri"/>
+                <w:b/>
+              </w:rPr>
+              <w:t>_</w:t>
             </w:r>
             <w:r>
               <w:rPr>
@@ -303,7 +324,14 @@
                 <w:b/>
                 <w:lang w:val="en-US"/>
               </w:rPr>
-              <w:t>${protocol_date}</w:t>
+              <w:t>date</w:t>
+            </w:r>
+            <w:r>
+              <w:rPr>
+                <w:rFonts w:ascii="Calibri" w:hAnsi="Calibri"/>
+                <w:b/>
+              </w:rPr>
+              <w:t>}</w:t>
             </w:r>
           </w:p>
           <w:p>
@@ -419,21 +447,26 @@
             <w:pPr>
               <w:rPr>
                 <w:rFonts w:ascii="Calibri" w:hAnsi="Calibri"/>
+              </w:rPr>
+            </w:pPr>
+            <w:r>
+              <w:rPr>
+                <w:rFonts w:ascii="Calibri" w:hAnsi="Calibri"/>
+              </w:rPr>
+              <w:t>Τηλέφωνο</w:t>
+            </w:r>
+            <w:r>
+              <w:rPr>
+                <w:rFonts w:ascii="Calibri" w:hAnsi="Calibri"/>
                 <w:lang w:val="en-US"/>
               </w:rPr>
-            </w:pPr>
-            <w:r>
-              <w:rPr>
-                <w:rFonts w:ascii="Calibri" w:hAnsi="Calibri"/>
-              </w:rPr>
-              <w:t>Τηλέφωνο</w:t>
-            </w:r>
-            <w:r>
-              <w:rPr>
-                <w:rFonts w:ascii="Calibri" w:hAnsi="Calibri"/>
-                <w:lang w:val="en-US"/>
-              </w:rPr>
-              <w:t xml:space="preserve">      :  2810 529313</w:t>
+              <w:t xml:space="preserve">      :  2810 </w:t>
+            </w:r>
+            <w:r>
+              <w:rPr>
+                <w:rFonts w:ascii="Calibri" w:hAnsi="Calibri"/>
+              </w:rPr>
+              <w:t>009896</w:t>
             </w:r>
           </w:p>
           <w:p>
@@ -702,16 +735,7 @@
           <w:sz w:val="26"/>
           <w:szCs w:val="26"/>
         </w:rPr>
-        <w:t>${sxetos}</w:t>
-      </w:r>
-      <w:r>
-        <w:rPr>
-          <w:rFonts w:ascii="Calibri" w:hAnsi="Calibri"/>
-          <w:b/>
-          <w:sz w:val="26"/>
-          <w:szCs w:val="26"/>
-        </w:rPr>
-        <w:t xml:space="preserve"> </w:t>
+        <w:t xml:space="preserve">${sxetos} </w:t>
       </w:r>
       <w:r>
         <w:rPr>

</xml_diff>